<commit_message>
timing on fpg_top is met
</commit_message>
<xml_diff>
--- a/docs/cellbox/CellBox.docx
+++ b/docs/cellbox/CellBox.docx
@@ -3,1513 +3,1860 @@
 <w:document xmlns:wpc="http://schemas.microsoft.com/office/word/2010/wordprocessingCanvas" xmlns:cx="http://schemas.microsoft.com/office/drawing/2014/chartex" xmlns:cx1="http://schemas.microsoft.com/office/drawing/2015/9/8/chartex" xmlns:cx2="http://schemas.microsoft.com/office/drawing/2015/10/21/chartex" xmlns:cx3="http://schemas.microsoft.com/office/drawing/2016/5/9/chartex" xmlns:cx4="http://schemas.microsoft.com/office/drawing/2016/5/10/chartex" xmlns:cx5="http://schemas.microsoft.com/office/drawing/2016/5/11/chartex" xmlns:cx6="http://schemas.microsoft.com/office/drawing/2016/5/12/chartex" xmlns:cx7="http://schemas.microsoft.com/office/drawing/2016/5/13/chartex" xmlns:cx8="http://schemas.microsoft.com/office/drawing/2016/5/14/chartex" xmlns:mc="http://schemas.openxmlformats.org/markup-compatibility/2006" xmlns:aink="http://schemas.microsoft.com/office/drawing/2016/ink" xmlns:am3d="http://schemas.microsoft.com/office/drawing/2017/model3d" xmlns:o="urn:schemas-microsoft-com:office:office" xmlns:oel="http://schemas.microsoft.com/office/2019/extlst" xmlns:r="http://schemas.openxmlformats.org/officeDocument/2006/relationships" xmlns:m="http://schemas.openxmlformats.org/officeDocument/2006/math" xmlns:v="urn:schemas-microsoft-com:vml" xmlns:wp14="http://schemas.microsoft.com/office/word/2010/wordprocessingDrawing" xmlns:wp="http://schemas.openxmlformats.org/drawingml/2006/wordprocessingDrawing" xmlns:w10="urn:schemas-microsoft-com:office:word" xmlns:w="http://schemas.openxmlformats.org/wordprocessingml/2006/main" xmlns:w14="http://schemas.microsoft.com/office/word/2010/wordml" xmlns:w15="http://schemas.microsoft.com/office/word/2012/wordml" xmlns:w16cex="http://schemas.microsoft.com/office/word/2018/wordml/cex" xmlns:w16cid="http://schemas.microsoft.com/office/word/2016/wordml/cid" xmlns:w16="http://schemas.microsoft.com/office/word/2018/wordml" xmlns:w16sdtdh="http://schemas.microsoft.com/office/word/2020/wordml/sdtdatahash" xmlns:w16se="http://schemas.microsoft.com/office/word/2015/wordml/symex" xmlns:wpg="http://schemas.microsoft.com/office/word/2010/wordprocessingGroup" xmlns:wpi="http://schemas.microsoft.com/office/word/2010/wordprocessingInk" xmlns:wne="http://schemas.microsoft.com/office/word/2006/wordml" xmlns:wps="http://schemas.microsoft.com/office/word/2010/wordprocessingShape" mc:Ignorable="w14 w15 w16se w16cid w16 w16cex w16sdtdh wp14">
   <w:body>
     <w:p>
-      <w:pPr>
-        <w:spacing w:after="0" w:line="240" w:lineRule="auto"/>
-        <w:rPr>
-          <w:rFonts w:ascii="Times New Roman" w:eastAsia="Times New Roman" w:hAnsi="Times New Roman" w:cs="Times New Roman"/>
-          <w:sz w:val="24"/>
-          <w:szCs w:val="24"/>
-        </w:rPr>
-      </w:pPr>
-      <w:r>
-        <w:rPr>
-          <w:rFonts w:ascii="Times New Roman" w:eastAsia="Times New Roman" w:hAnsi="Times New Roman" w:cs="Times New Roman"/>
-          <w:sz w:val="24"/>
-          <w:szCs w:val="24"/>
-        </w:rPr>
-        <w:pict w14:anchorId="7CEDBEC7">
-          <v:rect id="_x0000_i1065" style="width:0;height:1.5pt" o:hralign="center" o:hrstd="t" o:hr="t" fillcolor="#a0a0a0" stroked="f"/>
+      <w:r>
+        <w:pict w14:anchorId="22CDCC2A">
+          <v:rect id="_x0000_i1025" style="width:0;height:1.5pt" o:hralign="center" o:hrstd="t" o:hr="t" fillcolor="#a0a0a0" stroked="f"/>
         </w:pict>
       </w:r>
     </w:p>
     <w:p>
       <w:pPr>
-        <w:spacing w:before="100" w:beforeAutospacing="1" w:after="100" w:afterAutospacing="1" w:line="240" w:lineRule="auto"/>
-        <w:rPr>
-          <w:rFonts w:ascii="Times New Roman" w:eastAsia="Times New Roman" w:hAnsi="Times New Roman" w:cs="Times New Roman"/>
-          <w:sz w:val="24"/>
-          <w:szCs w:val="24"/>
-        </w:rPr>
-      </w:pPr>
-      <w:proofErr w:type="spellStart"/>
-      <w:r>
-        <w:rPr>
-          <w:rFonts w:ascii="Times New Roman" w:eastAsia="Times New Roman" w:hAnsi="Times New Roman" w:cs="Times New Roman"/>
+        <w:pStyle w:val="NormalWeb"/>
+        <w:rPr>
           <w:b/>
           <w:bCs/>
-          <w:sz w:val="24"/>
-          <w:szCs w:val="24"/>
-        </w:rPr>
-        <w:t>CellBox</w:t>
-      </w:r>
-      <w:proofErr w:type="spellEnd"/>
-      <w:r>
-        <w:rPr>
-          <w:rFonts w:ascii="Times New Roman" w:eastAsia="Times New Roman" w:hAnsi="Times New Roman" w:cs="Times New Roman"/>
+          <w:sz w:val="44"/>
+          <w:szCs w:val="44"/>
+        </w:rPr>
+      </w:pPr>
+      <w:r>
+        <w:rPr>
           <w:b/>
           <w:bCs/>
-          <w:sz w:val="24"/>
-          <w:szCs w:val="24"/>
-        </w:rPr>
-        <w:t>: A Cell-Granular Hierarchical Scheduler for High-Radix Switch Fabrics</w:t>
+          <w:sz w:val="44"/>
+          <w:szCs w:val="44"/>
+        </w:rPr>
+        <w:t>CellBox: A Cell-</w:t>
+      </w:r>
+      <w:r>
+        <w:rPr>
+          <w:b/>
+          <w:bCs/>
+          <w:sz w:val="44"/>
+          <w:szCs w:val="44"/>
+        </w:rPr>
+        <w:t>Granular</w:t>
+      </w:r>
+      <w:r>
+        <w:rPr>
+          <w:b/>
+          <w:bCs/>
+          <w:sz w:val="44"/>
+          <w:szCs w:val="44"/>
+        </w:rPr>
+        <w:t xml:space="preserve"> Hierarchical </w:t>
+      </w:r>
+      <w:r>
+        <w:rPr>
+          <w:b/>
+          <w:bCs/>
+          <w:sz w:val="44"/>
+          <w:szCs w:val="44"/>
+        </w:rPr>
+        <w:t xml:space="preserve">WFQ </w:t>
+      </w:r>
+      <w:r>
+        <w:rPr>
+          <w:b/>
+          <w:bCs/>
+          <w:sz w:val="44"/>
+          <w:szCs w:val="44"/>
+        </w:rPr>
+        <w:t xml:space="preserve">Scheduler for Low-Latency </w:t>
+      </w:r>
+      <w:r>
+        <w:rPr>
+          <w:b/>
+          <w:bCs/>
+          <w:sz w:val="44"/>
+          <w:szCs w:val="44"/>
+        </w:rPr>
+        <w:t>Switch</w:t>
+      </w:r>
+      <w:r>
+        <w:rPr>
+          <w:b/>
+          <w:bCs/>
+          <w:sz w:val="44"/>
+          <w:szCs w:val="44"/>
+        </w:rPr>
+        <w:t xml:space="preserve"> </w:t>
+      </w:r>
+      <w:r>
+        <w:rPr>
+          <w:b/>
+          <w:bCs/>
+          <w:sz w:val="44"/>
+          <w:szCs w:val="44"/>
+        </w:rPr>
+        <w:t>Hardware</w:t>
       </w:r>
     </w:p>
     <w:p>
       <w:pPr>
-        <w:spacing w:before="100" w:beforeAutospacing="1" w:after="100" w:afterAutospacing="1" w:line="240" w:lineRule="auto"/>
-        <w:rPr>
-          <w:rFonts w:ascii="Times New Roman" w:eastAsia="Times New Roman" w:hAnsi="Times New Roman" w:cs="Times New Roman"/>
-          <w:sz w:val="24"/>
-          <w:szCs w:val="24"/>
-        </w:rPr>
-      </w:pPr>
-      <w:r>
-        <w:rPr>
-          <w:rFonts w:ascii="Times New Roman" w:eastAsia="Times New Roman" w:hAnsi="Times New Roman" w:cs="Times New Roman"/>
-          <w:b/>
-          <w:bCs/>
-          <w:sz w:val="24"/>
-          <w:szCs w:val="24"/>
+        <w:pStyle w:val="NormalWeb"/>
+      </w:pPr>
+      <w:r>
+        <w:rPr>
+          <w:rStyle w:val="Strong"/>
         </w:rPr>
         <w:t>Abstract</w:t>
+      </w:r>
+      <w:r>
+        <w:br/>
+        <w:t>Hierarchical packet schedulers, such as Gearbox, have successfully demonstrated that Weighted Fair Queuing (WFQ) can be approximated in hardware with O(1) complexity. By organizing queues into a multi-level hierarchy, these designs achieve scalability that flat priority queues cannot match. However, existing hierarchical implementations suffer from two fundamental architectural limitations: granularity mismatch and memory fragmentation. First, scheduling variable-length packets introduces unavoidable "granularity jitter," where large packets distort the virtual time precision for latency-sensitive flows. Second, the reliance on statically partitioned buffers for each hierarchy level leads to significant memory waste, particularly under bursty traffic conditions common in data center workloads.</w:t>
       </w:r>
     </w:p>
     <w:p>
       <w:pPr>
-        <w:spacing w:before="100" w:beforeAutospacing="1" w:after="100" w:afterAutospacing="1" w:line="240" w:lineRule="auto"/>
-        <w:rPr>
-          <w:rFonts w:ascii="Times New Roman" w:eastAsia="Times New Roman" w:hAnsi="Times New Roman" w:cs="Times New Roman"/>
-          <w:sz w:val="24"/>
-          <w:szCs w:val="24"/>
-        </w:rPr>
-      </w:pPr>
-      <w:r>
-        <w:rPr>
-          <w:rFonts w:ascii="Times New Roman" w:eastAsia="Times New Roman" w:hAnsi="Times New Roman" w:cs="Times New Roman"/>
-          <w:sz w:val="24"/>
-          <w:szCs w:val="24"/>
-        </w:rPr>
-        <w:t>Hierarchical schedulers such as Gearbox have shown that it is possible to approximate weighted fair queuing in hardware while maintaining a bounded departure-time discrepancy through the use of multi-level scheduling structures. These designs strike a practical balance between fairness and implementation complexity, making them attractive for high-speed programmable switches. However, existing approaches also carry two structural drawbacks that limit their effectiveness in real systems. First, scheduling decisions are made at packet granularity, which ties service time directly to packet size and results in increased delay variance. Second, buffer memory is statically partitioned across hierarchy levels, leading to poor utilization of scarce on-chip memory resources in FPGA and ASIC implementations.</w:t>
+        <w:pStyle w:val="NormalWeb"/>
+      </w:pPr>
+      <w:r>
+        <w:t xml:space="preserve">This paper introduces </w:t>
+      </w:r>
+      <w:r>
+        <w:rPr>
+          <w:rStyle w:val="Strong"/>
+          <w:b w:val="0"/>
+          <w:bCs w:val="0"/>
+        </w:rPr>
+        <w:t>CellBox</w:t>
+      </w:r>
+      <w:r>
+        <w:t xml:space="preserve">, a hierarchical scheduler designed to resolve these inefficiencies by integrating cell-based switching with dynamic shared memory. Unlike prior approaches that schedule atomic packets, CellBox segments packets into fixed-size cells, decoupling scheduling precision from packet size distribution. Furthermore, it replaces static per-level FIFOs with a unified, dynamically managed memory pool, allowing buffer resources to flow elastically between hierarchy levels based on real-time demand. We present the CellBox architecture, provide a theoretical analysis demonstrating tighter delay bounds of </w:t>
+      </w:r>
+      <w:r>
+        <w:rPr>
+          <w:rStyle w:val="katex-mathml"/>
+          <w:i/>
+          <w:iCs/>
+        </w:rPr>
+        <w:t>(L−1)</w:t>
+      </w:r>
+      <w:r>
+        <w:rPr>
+          <w:rStyle w:val="katex-mathml"/>
+          <w:rFonts w:ascii="Cambria Math" w:hAnsi="Cambria Math" w:cs="Cambria Math"/>
+          <w:i/>
+          <w:iCs/>
+        </w:rPr>
+        <w:t>⋅</w:t>
+      </w:r>
+      <w:r>
+        <w:rPr>
+          <w:rStyle w:val="katex-mathml"/>
+          <w:i/>
+          <w:iCs/>
+        </w:rPr>
+        <w:t>T</w:t>
+      </w:r>
+      <w:r>
+        <w:rPr>
+          <w:rStyle w:val="katex-mathml"/>
+          <w:i/>
+          <w:iCs/>
+        </w:rPr>
+        <w:t>_</w:t>
+      </w:r>
+      <w:r>
+        <w:rPr>
+          <w:rStyle w:val="katex-mathml"/>
+          <w:i/>
+          <w:iCs/>
+        </w:rPr>
+        <w:t>cell</w:t>
+      </w:r>
+      <w:r>
+        <w:rPr>
+          <w:rStyle w:val="vlist-s"/>
+        </w:rPr>
+        <w:t>​</w:t>
+      </w:r>
+      <w:r>
+        <w:t>, and describe a hardware-efficient implementation strategy suitable for FPGA and ASIC deployment. CellBox offers a foundation for next-generation programmable switches that require both the fairness of WFQ and the resource efficiency of shared-memory architectures.</w:t>
       </w:r>
     </w:p>
     <w:p>
-      <w:pPr>
-        <w:spacing w:before="100" w:beforeAutospacing="1" w:after="100" w:afterAutospacing="1" w:line="240" w:lineRule="auto"/>
-        <w:rPr>
-          <w:rFonts w:ascii="Times New Roman" w:eastAsia="Times New Roman" w:hAnsi="Times New Roman" w:cs="Times New Roman"/>
-          <w:sz w:val="24"/>
-          <w:szCs w:val="24"/>
-        </w:rPr>
-      </w:pPr>
-      <w:r>
-        <w:rPr>
-          <w:rFonts w:ascii="Times New Roman" w:eastAsia="Times New Roman" w:hAnsi="Times New Roman" w:cs="Times New Roman"/>
-          <w:sz w:val="24"/>
-          <w:szCs w:val="24"/>
-        </w:rPr>
-        <w:t xml:space="preserve">This paper introduces </w:t>
-      </w:r>
-      <w:proofErr w:type="spellStart"/>
-      <w:r>
-        <w:rPr>
-          <w:rFonts w:ascii="Times New Roman" w:eastAsia="Times New Roman" w:hAnsi="Times New Roman" w:cs="Times New Roman"/>
-          <w:sz w:val="24"/>
-          <w:szCs w:val="24"/>
-        </w:rPr>
-        <w:t>CellBox</w:t>
-      </w:r>
-      <w:proofErr w:type="spellEnd"/>
-      <w:r>
-        <w:rPr>
-          <w:rFonts w:ascii="Times New Roman" w:eastAsia="Times New Roman" w:hAnsi="Times New Roman" w:cs="Times New Roman"/>
-          <w:sz w:val="24"/>
-          <w:szCs w:val="24"/>
-        </w:rPr>
-        <w:t xml:space="preserve">, a hierarchical scheduler that generalizes the drain-time discipline of Gearbox while removing both packet-level and memory-allocation inefficiencies. Instead of treating packets as indivisible scheduling units, </w:t>
-      </w:r>
-      <w:proofErr w:type="spellStart"/>
-      <w:r>
-        <w:rPr>
-          <w:rFonts w:ascii="Times New Roman" w:eastAsia="Times New Roman" w:hAnsi="Times New Roman" w:cs="Times New Roman"/>
-          <w:sz w:val="24"/>
-          <w:szCs w:val="24"/>
-        </w:rPr>
-        <w:t>CellBox</w:t>
-      </w:r>
-      <w:proofErr w:type="spellEnd"/>
-      <w:r>
-        <w:rPr>
-          <w:rFonts w:ascii="Times New Roman" w:eastAsia="Times New Roman" w:hAnsi="Times New Roman" w:cs="Times New Roman"/>
-          <w:sz w:val="24"/>
-          <w:szCs w:val="24"/>
-        </w:rPr>
-        <w:t xml:space="preserve"> segments packets into fixed-size cells and schedules these cells through a hierarchical drain structure. All cells are stored in a shared, dynamically managed memory pool rather than in statically allocated per-level FIFOs. This separation of scheduling precision from packet size yields more predictable delays, while elastic buffer allocation allows memory resources to adapt naturally to traffic dynamics.</w:t>
+      <w:r>
+        <w:pict w14:anchorId="4C1E3329">
+          <v:rect id="_x0000_i1026" style="width:0;height:1.5pt" o:hralign="center" o:hrstd="t" o:hr="t" fillcolor="#a0a0a0" stroked="f"/>
+        </w:pict>
       </w:r>
     </w:p>
     <w:p>
       <w:pPr>
-        <w:spacing w:before="100" w:beforeAutospacing="1" w:after="100" w:afterAutospacing="1" w:line="240" w:lineRule="auto"/>
-        <w:rPr>
-          <w:rFonts w:ascii="Times New Roman" w:eastAsia="Times New Roman" w:hAnsi="Times New Roman" w:cs="Times New Roman"/>
-          <w:sz w:val="24"/>
-          <w:szCs w:val="24"/>
-        </w:rPr>
-      </w:pPr>
-      <w:r>
-        <w:rPr>
-          <w:rFonts w:ascii="Times New Roman" w:eastAsia="Times New Roman" w:hAnsi="Times New Roman" w:cs="Times New Roman"/>
-          <w:sz w:val="24"/>
-          <w:szCs w:val="24"/>
-        </w:rPr>
-        <w:t xml:space="preserve">We describe the </w:t>
-      </w:r>
-      <w:proofErr w:type="spellStart"/>
-      <w:r>
-        <w:rPr>
-          <w:rFonts w:ascii="Times New Roman" w:eastAsia="Times New Roman" w:hAnsi="Times New Roman" w:cs="Times New Roman"/>
-          <w:sz w:val="24"/>
-          <w:szCs w:val="24"/>
-        </w:rPr>
-        <w:t>CellBox</w:t>
-      </w:r>
-      <w:proofErr w:type="spellEnd"/>
-      <w:r>
-        <w:rPr>
-          <w:rFonts w:ascii="Times New Roman" w:eastAsia="Times New Roman" w:hAnsi="Times New Roman" w:cs="Times New Roman"/>
-          <w:sz w:val="24"/>
-          <w:szCs w:val="24"/>
-        </w:rPr>
-        <w:t xml:space="preserve"> architecture, outline the hardware-oriented design choices that make it practical for implementation, and develop an analytical model demonstrating tighter delay bounds and reduced memory requirements compared to packet-based hierarchical schedulers. Designed as a drop-in replacement for existing FPGA QoS schedulers, </w:t>
-      </w:r>
-      <w:proofErr w:type="spellStart"/>
-      <w:r>
-        <w:rPr>
-          <w:rFonts w:ascii="Times New Roman" w:eastAsia="Times New Roman" w:hAnsi="Times New Roman" w:cs="Times New Roman"/>
-          <w:sz w:val="24"/>
-          <w:szCs w:val="24"/>
-        </w:rPr>
-        <w:t>CellBox</w:t>
-      </w:r>
-      <w:proofErr w:type="spellEnd"/>
-      <w:r>
-        <w:rPr>
-          <w:rFonts w:ascii="Times New Roman" w:eastAsia="Times New Roman" w:hAnsi="Times New Roman" w:cs="Times New Roman"/>
-          <w:sz w:val="24"/>
-          <w:szCs w:val="24"/>
-        </w:rPr>
-        <w:t xml:space="preserve"> provides a foundation for predictable, efficient, and adaptive scheduling in modern programmable data planes.</w:t>
+        <w:pStyle w:val="Heading3"/>
+      </w:pPr>
+      <w:r>
+        <w:t>1. Introduction</w:t>
       </w:r>
     </w:p>
     <w:p>
       <w:pPr>
-        <w:spacing w:after="0" w:line="240" w:lineRule="auto"/>
-        <w:rPr>
-          <w:rFonts w:ascii="Times New Roman" w:eastAsia="Times New Roman" w:hAnsi="Times New Roman" w:cs="Times New Roman"/>
-          <w:sz w:val="24"/>
-          <w:szCs w:val="24"/>
-        </w:rPr>
-      </w:pPr>
-      <w:r>
-        <w:rPr>
-          <w:rFonts w:ascii="Times New Roman" w:eastAsia="Times New Roman" w:hAnsi="Times New Roman" w:cs="Times New Roman"/>
-          <w:sz w:val="24"/>
-          <w:szCs w:val="24"/>
-        </w:rPr>
-        <w:pict w14:anchorId="47BCCDEE">
-          <v:rect id="_x0000_i1066" style="width:0;height:1.5pt" o:hralign="center" o:hrstd="t" o:hr="t" fillcolor="#a0a0a0" stroked="f"/>
-        </w:pict>
+        <w:pStyle w:val="NormalWeb"/>
+      </w:pPr>
+      <w:r>
+        <w:t>Modern programmable switch fabrics face conflicting demands: they must support high-radix scaling and high throughput while simultaneously enforcing strict Quality of Service (QoS) guarantees. As network speeds increase to 400 Gbps and beyond, the margin for scheduling latency and jitter shrinks, making the efficiency of the hardware scheduler critical.</w:t>
       </w:r>
     </w:p>
     <w:p>
       <w:pPr>
-        <w:spacing w:before="100" w:beforeAutospacing="1" w:after="100" w:afterAutospacing="1" w:line="240" w:lineRule="auto"/>
-        <w:outlineLvl w:val="2"/>
-        <w:rPr>
-          <w:rFonts w:ascii="Times New Roman" w:eastAsia="Times New Roman" w:hAnsi="Times New Roman" w:cs="Times New Roman"/>
-          <w:b/>
-          <w:bCs/>
-          <w:sz w:val="27"/>
-          <w:szCs w:val="27"/>
-        </w:rPr>
-      </w:pPr>
-      <w:r>
-        <w:rPr>
-          <w:rFonts w:ascii="Times New Roman" w:eastAsia="Times New Roman" w:hAnsi="Times New Roman" w:cs="Times New Roman"/>
-          <w:b/>
-          <w:bCs/>
-          <w:sz w:val="27"/>
-          <w:szCs w:val="27"/>
-        </w:rPr>
-        <w:t>1. Introduction</w:t>
+        <w:pStyle w:val="NormalWeb"/>
+      </w:pPr>
+      <w:r>
+        <w:t>Hierarchical schedulers, most notably Gearbox, have emerged as a leading solution. By employing a "drain-time" discipline across multiple levels of queues, Gearbox approximates the fairness of Weighted Fair Queuing (WFQ) without the prohibitive complexity of sorting algorithms. This approach allows the system to maintain bounded departure-time discrepancy (DTD)</w:t>
+      </w:r>
+      <w:r>
+        <w:t xml:space="preserve"> </w:t>
+      </w:r>
+      <w:r>
+        <w:t>a measure of how far a packets actual departure deviates from its ideal theoretical departure time.</w:t>
       </w:r>
     </w:p>
     <w:p>
       <w:pPr>
-        <w:spacing w:before="100" w:beforeAutospacing="1" w:after="100" w:afterAutospacing="1" w:line="240" w:lineRule="auto"/>
-        <w:rPr>
-          <w:rFonts w:ascii="Times New Roman" w:eastAsia="Times New Roman" w:hAnsi="Times New Roman" w:cs="Times New Roman"/>
-          <w:sz w:val="24"/>
-          <w:szCs w:val="24"/>
-        </w:rPr>
-      </w:pPr>
-      <w:r>
-        <w:rPr>
-          <w:rFonts w:ascii="Times New Roman" w:eastAsia="Times New Roman" w:hAnsi="Times New Roman" w:cs="Times New Roman"/>
-          <w:sz w:val="24"/>
-          <w:szCs w:val="24"/>
-        </w:rPr>
-        <w:t>Programmable switch fabrics are increasingly required to deliver high throughput while simultaneously meeting strict latency constraints and fine-grained quality-of-service guarantees across diverse traffic classes. These requirements place significant pressure on hardware schedulers, particularly in FPGA-based systems where on-chip memory is both limited and expensive. As a result, practical schedulers must not only be fair and predictable but also extremely efficient in their use of hardware resources.</w:t>
+        <w:pStyle w:val="NormalWeb"/>
+      </w:pPr>
+      <w:r>
+        <w:lastRenderedPageBreak/>
+        <w:t xml:space="preserve">However, the efficacy of current hierarchical schedulers is constrained by two legacy assumptions. First, they operate at </w:t>
+      </w:r>
+      <w:r>
+        <w:rPr>
+          <w:rStyle w:val="Strong"/>
+        </w:rPr>
+        <w:t>packet granularity</w:t>
+      </w:r>
+      <w:r>
+        <w:t xml:space="preserve">. In mixed workloads containing both 64-byte control messages and 9KB jumbo frames, a single large packet can block the scheduling "gear" for a significant duration. This coupling of service quantum to packet size introduces jitter that degrades tail latency for high-priority flows. Second, these systems typically employ </w:t>
+      </w:r>
+      <w:r>
+        <w:rPr>
+          <w:rStyle w:val="Strong"/>
+        </w:rPr>
+        <w:t>static buffer partitioning</w:t>
+      </w:r>
+      <w:r>
+        <w:t>, where on-chip memory is rigidly divided among hierarchy levels. This forces designers to provision for the worst case at every level, leading to severe memory fragmentation and underutilization when traffic patterns do not match static assumptions.</w:t>
       </w:r>
     </w:p>
     <w:p>
       <w:pPr>
-        <w:spacing w:before="100" w:beforeAutospacing="1" w:after="100" w:afterAutospacing="1" w:line="240" w:lineRule="auto"/>
-        <w:rPr>
-          <w:rFonts w:ascii="Times New Roman" w:eastAsia="Times New Roman" w:hAnsi="Times New Roman" w:cs="Times New Roman"/>
-          <w:sz w:val="24"/>
-          <w:szCs w:val="24"/>
-        </w:rPr>
-      </w:pPr>
-      <w:r>
-        <w:rPr>
-          <w:rFonts w:ascii="Times New Roman" w:eastAsia="Times New Roman" w:hAnsi="Times New Roman" w:cs="Times New Roman"/>
-          <w:sz w:val="24"/>
-          <w:szCs w:val="24"/>
-        </w:rPr>
-        <w:t xml:space="preserve">Hierarchical schedulers, most notably Gearbox, have emerged as a promising solution to this challenge. By organizing queues across multiple scheduling levels, Gearbox approximates weighted fair queuing with bounded departure-time discrepancy while retaining constant-time scheduling operations. This hierarchical structure allows it to scale in ways that flat priority </w:t>
-      </w:r>
-      <w:r>
-        <w:rPr>
-          <w:rFonts w:ascii="Times New Roman" w:eastAsia="Times New Roman" w:hAnsi="Times New Roman" w:cs="Times New Roman"/>
-          <w:sz w:val="24"/>
-          <w:szCs w:val="24"/>
-        </w:rPr>
-        <w:lastRenderedPageBreak/>
-        <w:t>queues cannot. However, the effectiveness of existing hierarchical schedulers is constrained by two architectural assumptions that become problematic under realistic workloads.</w:t>
+        <w:pStyle w:val="NormalWeb"/>
+      </w:pPr>
+      <w:r>
+        <w:t xml:space="preserve">We propose </w:t>
+      </w:r>
+      <w:r>
+        <w:rPr>
+          <w:rStyle w:val="Strong"/>
+        </w:rPr>
+        <w:t>CellBox</w:t>
+      </w:r>
+      <w:r>
+        <w:t>, a novel architecture that adapts the hierarchical drain-time discipline to a cell-switched, shared-memory paradigm. CellBox fundamentally rethinks the unit of scheduling:</w:t>
       </w:r>
     </w:p>
     <w:p>
       <w:pPr>
+        <w:numPr>
+          <w:ilvl w:val="0"/>
+          <w:numId w:val="34"/>
+        </w:numPr>
         <w:spacing w:before="100" w:beforeAutospacing="1" w:after="100" w:afterAutospacing="1" w:line="240" w:lineRule="auto"/>
-        <w:rPr>
-          <w:rFonts w:ascii="Times New Roman" w:eastAsia="Times New Roman" w:hAnsi="Times New Roman" w:cs="Times New Roman"/>
-          <w:sz w:val="24"/>
-          <w:szCs w:val="24"/>
-        </w:rPr>
-      </w:pPr>
-      <w:r>
-        <w:rPr>
-          <w:rFonts w:ascii="Times New Roman" w:eastAsia="Times New Roman" w:hAnsi="Times New Roman" w:cs="Times New Roman"/>
-          <w:sz w:val="24"/>
-          <w:szCs w:val="24"/>
-        </w:rPr>
-        <w:t>The first assumption is that packets are scheduled as atomic units. This directly couples scheduling behavior to packet size, leading to unavoidable delay variability and head-of-line blocking when traffic mixes include both small latency-sensitive packets and large bulk transfers. The second assumption is that each level of the scheduling hierarchy owns a fixed portion of the buffer memory. While this simplifies design, it forces worst-case provisioning at every level and results in memory fragmentation when traffic patterns deviate from those assumptions.</w:t>
+      </w:pPr>
+      <w:r>
+        <w:rPr>
+          <w:rStyle w:val="Strong"/>
+        </w:rPr>
+        <w:t>Granularity Independence:</w:t>
+      </w:r>
+      <w:r>
+        <w:t xml:space="preserve"> By segmenting packets into fixed-size cells (e.g., 64 bytes) at ingress, CellBox ensures a constant service quantum. This eliminates packet-size induced jitter and tightens delay bounds.</w:t>
       </w:r>
     </w:p>
     <w:p>
       <w:pPr>
+        <w:numPr>
+          <w:ilvl w:val="0"/>
+          <w:numId w:val="34"/>
+        </w:numPr>
         <w:spacing w:before="100" w:beforeAutospacing="1" w:after="100" w:afterAutospacing="1" w:line="240" w:lineRule="auto"/>
-        <w:rPr>
-          <w:rFonts w:ascii="Times New Roman" w:eastAsia="Times New Roman" w:hAnsi="Times New Roman" w:cs="Times New Roman"/>
-          <w:sz w:val="24"/>
-          <w:szCs w:val="24"/>
-        </w:rPr>
-      </w:pPr>
-      <w:r>
-        <w:rPr>
-          <w:rFonts w:ascii="Times New Roman" w:eastAsia="Times New Roman" w:hAnsi="Times New Roman" w:cs="Times New Roman"/>
-          <w:sz w:val="24"/>
-          <w:szCs w:val="24"/>
-        </w:rPr>
-        <w:t xml:space="preserve">This paper argues that both limitations stem from treating packets as indivisible entities and hierarchy levels as isolated buffering domains. To address these issues, we propose </w:t>
-      </w:r>
-      <w:proofErr w:type="spellStart"/>
-      <w:r>
-        <w:rPr>
-          <w:rFonts w:ascii="Times New Roman" w:eastAsia="Times New Roman" w:hAnsi="Times New Roman" w:cs="Times New Roman"/>
-          <w:sz w:val="24"/>
-          <w:szCs w:val="24"/>
-        </w:rPr>
-        <w:t>CellBox</w:t>
-      </w:r>
-      <w:proofErr w:type="spellEnd"/>
-      <w:r>
-        <w:rPr>
-          <w:rFonts w:ascii="Times New Roman" w:eastAsia="Times New Roman" w:hAnsi="Times New Roman" w:cs="Times New Roman"/>
-          <w:sz w:val="24"/>
-          <w:szCs w:val="24"/>
-        </w:rPr>
-        <w:t xml:space="preserve">, a hierarchical scheduler that operates at cell granularity and uses a shared dynamic memory pool. By rethinking both the unit of scheduling and the organization of buffers, </w:t>
-      </w:r>
-      <w:proofErr w:type="spellStart"/>
-      <w:r>
-        <w:rPr>
-          <w:rFonts w:ascii="Times New Roman" w:eastAsia="Times New Roman" w:hAnsi="Times New Roman" w:cs="Times New Roman"/>
-          <w:sz w:val="24"/>
-          <w:szCs w:val="24"/>
-        </w:rPr>
-        <w:t>CellBox</w:t>
-      </w:r>
-      <w:proofErr w:type="spellEnd"/>
-      <w:r>
-        <w:rPr>
-          <w:rFonts w:ascii="Times New Roman" w:eastAsia="Times New Roman" w:hAnsi="Times New Roman" w:cs="Times New Roman"/>
-          <w:sz w:val="24"/>
-          <w:szCs w:val="24"/>
-        </w:rPr>
-        <w:t xml:space="preserve"> preserves the core advantages of hierarchical scheduling while significantly improving delay predictability and memory efficiency.</w:t>
+      </w:pPr>
+      <w:r>
+        <w:rPr>
+          <w:rStyle w:val="Strong"/>
+        </w:rPr>
+        <w:t>Memory Elasticity:</w:t>
+      </w:r>
+      <w:r>
+        <w:t xml:space="preserve"> By utilizing a unified linked-list memory pool, CellBox allows logical hierarchy levels to share physical buffer space dynamically. This enables the absorption of traffic bursts that would overflow statically partitioned queues, significantly improving effective buffer utilization.</w:t>
       </w:r>
     </w:p>
     <w:p>
       <w:pPr>
-        <w:spacing w:after="0" w:line="240" w:lineRule="auto"/>
-        <w:rPr>
-          <w:rFonts w:ascii="Times New Roman" w:eastAsia="Times New Roman" w:hAnsi="Times New Roman" w:cs="Times New Roman"/>
-          <w:sz w:val="24"/>
-          <w:szCs w:val="24"/>
-        </w:rPr>
-      </w:pPr>
-      <w:r>
-        <w:rPr>
-          <w:rFonts w:ascii="Times New Roman" w:eastAsia="Times New Roman" w:hAnsi="Times New Roman" w:cs="Times New Roman"/>
-          <w:sz w:val="24"/>
-          <w:szCs w:val="24"/>
-        </w:rPr>
-        <w:pict w14:anchorId="31350432">
-          <v:rect id="_x0000_i1067" style="width:0;height:1.5pt" o:hralign="center" o:hrstd="t" o:hr="t" fillcolor="#a0a0a0" stroked="f"/>
-        </w:pict>
+        <w:pStyle w:val="NormalWeb"/>
+      </w:pPr>
+      <w:r>
+        <w:t>This paper details the design and analytical foundations of CellBox. We describe the hardware pipeline required to support cell-granular hierarchical scheduling and provide a theoretical model contrasting the delay and memory properties of CellBox against packet-based baselines.</w:t>
       </w:r>
     </w:p>
     <w:p>
-      <w:pPr>
-        <w:spacing w:before="100" w:beforeAutospacing="1" w:after="100" w:afterAutospacing="1" w:line="240" w:lineRule="auto"/>
-        <w:outlineLvl w:val="2"/>
-        <w:rPr>
-          <w:rFonts w:ascii="Times New Roman" w:eastAsia="Times New Roman" w:hAnsi="Times New Roman" w:cs="Times New Roman"/>
-          <w:b/>
-          <w:bCs/>
-          <w:sz w:val="27"/>
-          <w:szCs w:val="27"/>
-        </w:rPr>
-      </w:pPr>
-      <w:r>
-        <w:rPr>
-          <w:rFonts w:ascii="Times New Roman" w:eastAsia="Times New Roman" w:hAnsi="Times New Roman" w:cs="Times New Roman"/>
-          <w:b/>
-          <w:bCs/>
-          <w:sz w:val="27"/>
-          <w:szCs w:val="27"/>
-        </w:rPr>
-        <w:t>2. Background and Motivation</w:t>
+      <w:r>
+        <w:pict w14:anchorId="3D9D85CF">
+          <v:rect id="_x0000_i1027" style="width:0;height:1.5pt" o:hralign="center" o:hrstd="t" o:hr="t" fillcolor="#a0a0a0" stroked="f"/>
+        </w:pict>
       </w:r>
     </w:p>
     <w:p>
       <w:pPr>
-        <w:spacing w:before="100" w:beforeAutospacing="1" w:after="100" w:afterAutospacing="1" w:line="240" w:lineRule="auto"/>
-        <w:rPr>
-          <w:rFonts w:ascii="Times New Roman" w:eastAsia="Times New Roman" w:hAnsi="Times New Roman" w:cs="Times New Roman"/>
-          <w:sz w:val="24"/>
-          <w:szCs w:val="24"/>
-        </w:rPr>
-      </w:pPr>
-      <w:r>
-        <w:rPr>
-          <w:rFonts w:ascii="Times New Roman" w:eastAsia="Times New Roman" w:hAnsi="Times New Roman" w:cs="Times New Roman"/>
-          <w:sz w:val="24"/>
-          <w:szCs w:val="24"/>
-        </w:rPr>
-        <w:t>Gearbox introduced the idea of hierarchical drain-time scheduling, in which packets are distributed across multiple levels corresponding to different service timescales. As a packet’s virtual finish time approaches the current time, it migrates toward finer-grained levels in the hierarchy. This mechanism allows Gearbox to approximate weighted fair queuing with bounded departure-time discrepancy while maintaining constant-time operations suitable for hardware.</w:t>
+        <w:pStyle w:val="Heading3"/>
+      </w:pPr>
+      <w:r>
+        <w:t>2. Background and Motivation</w:t>
       </w:r>
     </w:p>
     <w:p>
       <w:pPr>
-        <w:spacing w:before="100" w:beforeAutospacing="1" w:after="100" w:afterAutospacing="1" w:line="240" w:lineRule="auto"/>
-        <w:rPr>
-          <w:rFonts w:ascii="Times New Roman" w:eastAsia="Times New Roman" w:hAnsi="Times New Roman" w:cs="Times New Roman"/>
-          <w:sz w:val="24"/>
-          <w:szCs w:val="24"/>
-        </w:rPr>
-      </w:pPr>
-      <w:r>
-        <w:rPr>
-          <w:rFonts w:ascii="Times New Roman" w:eastAsia="Times New Roman" w:hAnsi="Times New Roman" w:cs="Times New Roman"/>
-          <w:sz w:val="24"/>
-          <w:szCs w:val="24"/>
-        </w:rPr>
-        <w:t>Despite its conceptual elegance, Gearbox relies on two simplifying assumptions that limit its practicality. Packets are scheduled as indivisible units, and each level in the hierarchy is backed by a statically allocated buffer. While these assumptions make the design easier to reason about, they introduce inefficiencies when implemented in hardware that must support diverse and dynamic traffic mixes.</w:t>
+        <w:pStyle w:val="Heading4"/>
+      </w:pPr>
+      <w:r>
+        <w:t>2.1 The Gearbox Approach and Its Limits</w:t>
       </w:r>
     </w:p>
     <w:p>
       <w:pPr>
-        <w:spacing w:before="100" w:beforeAutospacing="1" w:after="100" w:afterAutospacing="1" w:line="240" w:lineRule="auto"/>
-        <w:rPr>
-          <w:rFonts w:ascii="Times New Roman" w:eastAsia="Times New Roman" w:hAnsi="Times New Roman" w:cs="Times New Roman"/>
-          <w:sz w:val="24"/>
-          <w:szCs w:val="24"/>
-        </w:rPr>
-      </w:pPr>
-      <w:r>
-        <w:rPr>
-          <w:rFonts w:ascii="Times New Roman" w:eastAsia="Times New Roman" w:hAnsi="Times New Roman" w:cs="Times New Roman"/>
-          <w:sz w:val="24"/>
-          <w:szCs w:val="24"/>
-        </w:rPr>
-        <w:t>Scheduling at packet granularity inherently introduces service-time variability because packet sizes vary widely. Large packets can dominate transmission opportunities, increasing tail latency for smaller packets and amplifying delay jitter. Although Gearbox bounds departure-time discrepancy relative to packet transmission time, that bound remains coarse and strongly dependent on the maximum packet size in the system. This effect is especially harmful in fabrics carrying control traffic, remote procedure calls, and large data transfers simultaneously.</w:t>
+        <w:pStyle w:val="NormalWeb"/>
+      </w:pPr>
+      <w:r>
+        <w:t>Gearbox introduced the concept of hierarchical drain-time scheduling to approximate WFQ. It assigns packets to different "levels" based on their required service rate (or virtual finish time). Packets migrate from coarser levels to finer levels as their departure time approaches. While theoretically sound, Gearbox</w:t>
+      </w:r>
+      <w:r>
+        <w:t>’</w:t>
+      </w:r>
+      <w:r>
+        <w:t xml:space="preserve">s reliance on packet-based scheduling creates a dependency between the </w:t>
+      </w:r>
+      <w:r>
+        <w:rPr>
+          <w:rStyle w:val="Strong"/>
+          <w:b w:val="0"/>
+          <w:bCs w:val="0"/>
+        </w:rPr>
+        <w:t>Departure Time Discrepancy (DTD</w:t>
+      </w:r>
+      <w:r>
+        <w:rPr>
+          <w:rStyle w:val="Strong"/>
+        </w:rPr>
+        <w:t>)</w:t>
+      </w:r>
+      <w:r>
+        <w:t xml:space="preserve"> and the Maximum Transmission Unit (MTU). Specifically, the delay bound scales with </w:t>
+      </w:r>
+      <w:r>
+        <w:rPr>
+          <w:rStyle w:val="katex-mathml"/>
+          <w:i/>
+          <w:iCs/>
+        </w:rPr>
+        <w:t>(L−1)×MaxPacketSize</w:t>
+      </w:r>
+      <w:r>
+        <w:t>. In networks supporting jumbo frames, this bound becomes coarse, undermining the low-latency goals of the scheduler.</w:t>
       </w:r>
     </w:p>
     <w:p>
       <w:pPr>
-        <w:spacing w:before="100" w:beforeAutospacing="1" w:after="100" w:afterAutospacing="1" w:line="240" w:lineRule="auto"/>
-        <w:rPr>
-          <w:rFonts w:ascii="Times New Roman" w:eastAsia="Times New Roman" w:hAnsi="Times New Roman" w:cs="Times New Roman"/>
-          <w:sz w:val="24"/>
-          <w:szCs w:val="24"/>
-        </w:rPr>
-      </w:pPr>
-      <w:r>
-        <w:rPr>
-          <w:rFonts w:ascii="Times New Roman" w:eastAsia="Times New Roman" w:hAnsi="Times New Roman" w:cs="Times New Roman"/>
-          <w:sz w:val="24"/>
-          <w:szCs w:val="24"/>
-        </w:rPr>
-        <w:t>Static buffer partitioning further exacerbates the problem. Hierarchical schedulers typically allocate separate FIFOs for each level, sized to handle worst-case occupancy. In practice, traffic rarely stresses all levels at once, leaving much of the allocated memory underutilized while other levels experience congestion. On FPGA platforms, where block RAM is a scarce resource, this inefficiency directly limits system scale and flexibility.</w:t>
+        <w:pStyle w:val="Heading4"/>
+      </w:pPr>
+      <w:r>
+        <w:t>2.2 The Memory Fragmentation Problem</w:t>
       </w:r>
     </w:p>
     <w:p>
       <w:pPr>
-        <w:spacing w:before="100" w:beforeAutospacing="1" w:after="100" w:afterAutospacing="1" w:line="240" w:lineRule="auto"/>
-        <w:rPr>
-          <w:rFonts w:ascii="Times New Roman" w:eastAsia="Times New Roman" w:hAnsi="Times New Roman" w:cs="Times New Roman"/>
-          <w:sz w:val="24"/>
-          <w:szCs w:val="24"/>
-        </w:rPr>
-      </w:pPr>
-      <w:r>
-        <w:rPr>
-          <w:rFonts w:ascii="Times New Roman" w:eastAsia="Times New Roman" w:hAnsi="Times New Roman" w:cs="Times New Roman"/>
-          <w:sz w:val="24"/>
-          <w:szCs w:val="24"/>
-        </w:rPr>
-        <w:lastRenderedPageBreak/>
-        <w:t xml:space="preserve">Cell-based switching and shared-memory architectures have each been studied extensively in isolation. Fixed-size cells are known to provide predictable service by eliminating packet-size bias, while shared-memory designs improve utilization through statistical multiplexing. However, these ideas have not previously been integrated into a hierarchical scheduler that approximates weighted fair queuing. </w:t>
-      </w:r>
-      <w:proofErr w:type="spellStart"/>
-      <w:r>
-        <w:rPr>
-          <w:rFonts w:ascii="Times New Roman" w:eastAsia="Times New Roman" w:hAnsi="Times New Roman" w:cs="Times New Roman"/>
-          <w:sz w:val="24"/>
-          <w:szCs w:val="24"/>
-        </w:rPr>
-        <w:t>CellBox</w:t>
-      </w:r>
-      <w:proofErr w:type="spellEnd"/>
-      <w:r>
-        <w:rPr>
-          <w:rFonts w:ascii="Times New Roman" w:eastAsia="Times New Roman" w:hAnsi="Times New Roman" w:cs="Times New Roman"/>
-          <w:sz w:val="24"/>
-          <w:szCs w:val="24"/>
-        </w:rPr>
-        <w:t xml:space="preserve"> is designed to fill this gap by combining cell-granular scheduling with shared dynamic memory within a hierarchical framework.</w:t>
+        <w:pStyle w:val="NormalWeb"/>
+      </w:pPr>
+      <w:r>
+        <w:t xml:space="preserve">Hardware resources on FPGAs and switching ASICs are finite. Traditional hierarchical schedulers implement levels using separate physical FIFOs. To prevent packet drops, each FIFO must be sized to handle potential bursts, leading to a summation of worst-case requirements: </w:t>
+      </w:r>
+      <w:r>
+        <w:rPr>
+          <w:rStyle w:val="mord"/>
+          <w:i/>
+          <w:iCs/>
+        </w:rPr>
+        <w:t>M</w:t>
+      </w:r>
+      <w:r>
+        <w:rPr>
+          <w:rStyle w:val="mord"/>
+          <w:i/>
+          <w:iCs/>
+        </w:rPr>
+        <w:t>_</w:t>
+      </w:r>
+      <w:r>
+        <w:rPr>
+          <w:rStyle w:val="mord"/>
+          <w:i/>
+          <w:iCs/>
+        </w:rPr>
+        <w:t>total</w:t>
+      </w:r>
+      <w:r>
+        <w:rPr>
+          <w:rStyle w:val="vlist-s"/>
+          <w:i/>
+          <w:iCs/>
+        </w:rPr>
+        <w:t>​</w:t>
+      </w:r>
+      <w:r>
+        <w:rPr>
+          <w:rStyle w:val="mrel"/>
+          <w:i/>
+          <w:iCs/>
+        </w:rPr>
+        <w:t>=</w:t>
+      </w:r>
+      <w:r>
+        <w:rPr>
+          <w:rStyle w:val="mop"/>
+          <w:i/>
+          <w:iCs/>
+        </w:rPr>
+        <w:t>∑</w:t>
+      </w:r>
+      <w:r>
+        <w:rPr>
+          <w:rStyle w:val="mord"/>
+          <w:i/>
+          <w:iCs/>
+        </w:rPr>
+        <w:t>Mlevel_max</w:t>
+      </w:r>
+      <w:r>
+        <w:rPr>
+          <w:rStyle w:val="vlist-s"/>
+        </w:rPr>
+        <w:t>​</w:t>
+      </w:r>
+      <w:r>
+        <w:t>. In practice, traffic rarely peaks at all levels simultaneously. Consequently, memory allocated to idle levels sits wasted while active levels may face congestion, a phenomenon known as memory fragmentation.</w:t>
       </w:r>
     </w:p>
     <w:p>
       <w:pPr>
-        <w:spacing w:after="0" w:line="240" w:lineRule="auto"/>
-        <w:rPr>
-          <w:rFonts w:ascii="Times New Roman" w:eastAsia="Times New Roman" w:hAnsi="Times New Roman" w:cs="Times New Roman"/>
-          <w:sz w:val="24"/>
-          <w:szCs w:val="24"/>
-        </w:rPr>
-      </w:pPr>
-      <w:r>
-        <w:rPr>
-          <w:rFonts w:ascii="Times New Roman" w:eastAsia="Times New Roman" w:hAnsi="Times New Roman" w:cs="Times New Roman"/>
-          <w:sz w:val="24"/>
-          <w:szCs w:val="24"/>
-        </w:rPr>
-        <w:pict w14:anchorId="59EEB8BF">
-          <v:rect id="_x0000_i1068" style="width:0;height:1.5pt" o:hralign="center" o:hrstd="t" o:hr="t" fillcolor="#a0a0a0" stroked="f"/>
-        </w:pict>
+        <w:pStyle w:val="Heading4"/>
+      </w:pPr>
+      <w:r>
+        <w:lastRenderedPageBreak/>
+        <w:t>2.3 The Case for Cell-Granular Switching</w:t>
       </w:r>
     </w:p>
     <w:p>
       <w:pPr>
-        <w:spacing w:before="100" w:beforeAutospacing="1" w:after="100" w:afterAutospacing="1" w:line="240" w:lineRule="auto"/>
-        <w:outlineLvl w:val="2"/>
-        <w:rPr>
-          <w:rFonts w:ascii="Times New Roman" w:eastAsia="Times New Roman" w:hAnsi="Times New Roman" w:cs="Times New Roman"/>
-          <w:b/>
-          <w:bCs/>
-          <w:sz w:val="27"/>
-          <w:szCs w:val="27"/>
-        </w:rPr>
-      </w:pPr>
-      <w:r>
-        <w:rPr>
-          <w:rFonts w:ascii="Times New Roman" w:eastAsia="Times New Roman" w:hAnsi="Times New Roman" w:cs="Times New Roman"/>
-          <w:b/>
-          <w:bCs/>
-          <w:sz w:val="27"/>
-          <w:szCs w:val="27"/>
-        </w:rPr>
-        <w:t xml:space="preserve">3. </w:t>
-      </w:r>
-      <w:proofErr w:type="spellStart"/>
-      <w:r>
-        <w:rPr>
-          <w:rFonts w:ascii="Times New Roman" w:eastAsia="Times New Roman" w:hAnsi="Times New Roman" w:cs="Times New Roman"/>
-          <w:b/>
-          <w:bCs/>
-          <w:sz w:val="27"/>
-          <w:szCs w:val="27"/>
-        </w:rPr>
-        <w:t>CellBox</w:t>
-      </w:r>
-      <w:proofErr w:type="spellEnd"/>
-      <w:r>
-        <w:rPr>
-          <w:rFonts w:ascii="Times New Roman" w:eastAsia="Times New Roman" w:hAnsi="Times New Roman" w:cs="Times New Roman"/>
-          <w:b/>
-          <w:bCs/>
-          <w:sz w:val="27"/>
-          <w:szCs w:val="27"/>
-        </w:rPr>
-        <w:t xml:space="preserve"> Design Overview</w:t>
+        <w:pStyle w:val="NormalWeb"/>
+      </w:pPr>
+      <w:r>
+        <w:t>Cell-based switching, historically used in ATM and modern high-performance fabrics, segments variable packets into fixed units. While this introduces segmentation and reassembly (SAR) overhead, it offers deterministic switching behavior. By integrating this paradigm with hierarchical scheduling, CellBox aims to combine the fairness of Gearbox with the predictability of cell switching.</w:t>
       </w:r>
     </w:p>
     <w:p>
-      <w:pPr>
-        <w:spacing w:before="100" w:beforeAutospacing="1" w:after="100" w:afterAutospacing="1" w:line="240" w:lineRule="auto"/>
-        <w:rPr>
-          <w:rFonts w:ascii="Times New Roman" w:eastAsia="Times New Roman" w:hAnsi="Times New Roman" w:cs="Times New Roman"/>
-          <w:sz w:val="24"/>
-          <w:szCs w:val="24"/>
-        </w:rPr>
-      </w:pPr>
-      <w:r>
-        <w:rPr>
-          <w:rFonts w:ascii="Times New Roman" w:eastAsia="Times New Roman" w:hAnsi="Times New Roman" w:cs="Times New Roman"/>
-          <w:sz w:val="24"/>
-          <w:szCs w:val="24"/>
-        </w:rPr>
-        <w:t xml:space="preserve">The design of </w:t>
-      </w:r>
-      <w:proofErr w:type="spellStart"/>
-      <w:r>
-        <w:rPr>
-          <w:rFonts w:ascii="Times New Roman" w:eastAsia="Times New Roman" w:hAnsi="Times New Roman" w:cs="Times New Roman"/>
-          <w:sz w:val="24"/>
-          <w:szCs w:val="24"/>
-        </w:rPr>
-        <w:t>CellBox</w:t>
-      </w:r>
-      <w:proofErr w:type="spellEnd"/>
-      <w:r>
-        <w:rPr>
-          <w:rFonts w:ascii="Times New Roman" w:eastAsia="Times New Roman" w:hAnsi="Times New Roman" w:cs="Times New Roman"/>
-          <w:sz w:val="24"/>
-          <w:szCs w:val="24"/>
-        </w:rPr>
-        <w:t xml:space="preserve"> is driven by a small set of guiding principles. Scheduling decisions are made using a fixed service quantum, achieved by operating on fixed-size cells rather than variable-length packets. The hierarchical drain-time structure of prior schedulers is preserved to retain scalability and fairness. All buffering is drawn from a shared memory pool, allowing buffer space to be allocated dynamically where it is needed. Finally, all critical operations are designed to remain constant time, ensuring feasibility in high-speed hardware.</w:t>
+      <w:r>
+        <w:pict w14:anchorId="5F232ED6">
+          <v:rect id="_x0000_i1028" style="width:0;height:1.5pt" o:hralign="center" o:hrstd="t" o:hr="t" fillcolor="#a0a0a0" stroked="f"/>
+        </w:pict>
       </w:r>
     </w:p>
     <w:p>
       <w:pPr>
-        <w:spacing w:before="100" w:beforeAutospacing="1" w:after="100" w:afterAutospacing="1" w:line="240" w:lineRule="auto"/>
-        <w:rPr>
-          <w:rFonts w:ascii="Times New Roman" w:eastAsia="Times New Roman" w:hAnsi="Times New Roman" w:cs="Times New Roman"/>
-          <w:sz w:val="24"/>
-          <w:szCs w:val="24"/>
-        </w:rPr>
-      </w:pPr>
-      <w:r>
-        <w:rPr>
-          <w:rFonts w:ascii="Times New Roman" w:eastAsia="Times New Roman" w:hAnsi="Times New Roman" w:cs="Times New Roman"/>
-          <w:sz w:val="24"/>
-          <w:szCs w:val="24"/>
-        </w:rPr>
-        <w:t xml:space="preserve">At a high level, </w:t>
-      </w:r>
-      <w:proofErr w:type="spellStart"/>
-      <w:r>
-        <w:rPr>
-          <w:rFonts w:ascii="Times New Roman" w:eastAsia="Times New Roman" w:hAnsi="Times New Roman" w:cs="Times New Roman"/>
-          <w:sz w:val="24"/>
-          <w:szCs w:val="24"/>
-        </w:rPr>
-        <w:t>CellBox</w:t>
-      </w:r>
-      <w:proofErr w:type="spellEnd"/>
-      <w:r>
-        <w:rPr>
-          <w:rFonts w:ascii="Times New Roman" w:eastAsia="Times New Roman" w:hAnsi="Times New Roman" w:cs="Times New Roman"/>
-          <w:sz w:val="24"/>
-          <w:szCs w:val="24"/>
-        </w:rPr>
-        <w:t xml:space="preserve"> consists of three cooperating components. Incoming packets first pass through a </w:t>
-      </w:r>
-      <w:proofErr w:type="spellStart"/>
-      <w:r>
-        <w:rPr>
-          <w:rFonts w:ascii="Times New Roman" w:eastAsia="Times New Roman" w:hAnsi="Times New Roman" w:cs="Times New Roman"/>
-          <w:sz w:val="24"/>
-          <w:szCs w:val="24"/>
-        </w:rPr>
-        <w:t>cellization</w:t>
-      </w:r>
-      <w:proofErr w:type="spellEnd"/>
-      <w:r>
-        <w:rPr>
-          <w:rFonts w:ascii="Times New Roman" w:eastAsia="Times New Roman" w:hAnsi="Times New Roman" w:cs="Times New Roman"/>
-          <w:sz w:val="24"/>
-          <w:szCs w:val="24"/>
-        </w:rPr>
-        <w:t xml:space="preserve"> layer, where they are segmented into fixed-size cells that carry the necessary scheduling metadata. These cells are stored in a global shared memory pool managed through linked-list structures. A hierarchical cell scheduler then selects cells for transmission using a drain-time discipline analogous to Gearbox, but adapted to operate on cells rather than packets. Each hierarchy level maintains logical queues implemented as references into the shared memory pool rather than as dedicated physical buffers.</w:t>
+        <w:pStyle w:val="Heading3"/>
+      </w:pPr>
+      <w:r>
+        <w:t>3. CellBox Architecture</w:t>
       </w:r>
     </w:p>
     <w:p>
       <w:pPr>
-        <w:spacing w:after="0" w:line="240" w:lineRule="auto"/>
-        <w:rPr>
-          <w:rFonts w:ascii="Times New Roman" w:eastAsia="Times New Roman" w:hAnsi="Times New Roman" w:cs="Times New Roman"/>
-          <w:sz w:val="24"/>
-          <w:szCs w:val="24"/>
-        </w:rPr>
-      </w:pPr>
-      <w:r>
-        <w:rPr>
-          <w:rFonts w:ascii="Times New Roman" w:eastAsia="Times New Roman" w:hAnsi="Times New Roman" w:cs="Times New Roman"/>
-          <w:sz w:val="24"/>
-          <w:szCs w:val="24"/>
-        </w:rPr>
-        <w:pict w14:anchorId="36325546">
-          <v:rect id="_x0000_i1069" style="width:0;height:1.5pt" o:hralign="center" o:hrstd="t" o:hr="t" fillcolor="#a0a0a0" stroked="f"/>
-        </w:pict>
+        <w:pStyle w:val="NormalWeb"/>
+      </w:pPr>
+      <w:r>
+        <w:t>CellBox is designed as a drop-in replacement for standard QoS schedulers in programmable switch pipelines. The architecture consists of three primary stages: Ingress Cellization, the Hierarchical Cell Scheduler, and the Shared Memory Manager.</w:t>
       </w:r>
     </w:p>
     <w:p>
       <w:pPr>
-        <w:spacing w:before="100" w:beforeAutospacing="1" w:after="100" w:afterAutospacing="1" w:line="240" w:lineRule="auto"/>
-        <w:outlineLvl w:val="2"/>
-        <w:rPr>
-          <w:rFonts w:ascii="Times New Roman" w:eastAsia="Times New Roman" w:hAnsi="Times New Roman" w:cs="Times New Roman"/>
-          <w:b/>
-          <w:bCs/>
-          <w:sz w:val="27"/>
-          <w:szCs w:val="27"/>
-        </w:rPr>
-      </w:pPr>
-      <w:r>
-        <w:rPr>
-          <w:rFonts w:ascii="Times New Roman" w:eastAsia="Times New Roman" w:hAnsi="Times New Roman" w:cs="Times New Roman"/>
-          <w:b/>
-          <w:bCs/>
-          <w:sz w:val="27"/>
-          <w:szCs w:val="27"/>
-        </w:rPr>
-        <w:t>4. Cell-Granular Hierarchical Scheduling</w:t>
+        <w:pStyle w:val="Heading4"/>
+      </w:pPr>
+      <w:r>
+        <w:t>3.1 Ingress Cellization and Metadata</w:t>
       </w:r>
     </w:p>
     <w:p>
       <w:pPr>
-        <w:spacing w:before="100" w:beforeAutospacing="1" w:after="100" w:afterAutospacing="1" w:line="240" w:lineRule="auto"/>
-        <w:rPr>
-          <w:rFonts w:ascii="Times New Roman" w:eastAsia="Times New Roman" w:hAnsi="Times New Roman" w:cs="Times New Roman"/>
-          <w:sz w:val="24"/>
-          <w:szCs w:val="24"/>
-        </w:rPr>
-      </w:pPr>
-      <w:r>
-        <w:rPr>
-          <w:rFonts w:ascii="Times New Roman" w:eastAsia="Times New Roman" w:hAnsi="Times New Roman" w:cs="Times New Roman"/>
-          <w:sz w:val="24"/>
-          <w:szCs w:val="24"/>
-        </w:rPr>
-        <w:t xml:space="preserve">In </w:t>
-      </w:r>
-      <w:proofErr w:type="spellStart"/>
-      <w:r>
-        <w:rPr>
-          <w:rFonts w:ascii="Times New Roman" w:eastAsia="Times New Roman" w:hAnsi="Times New Roman" w:cs="Times New Roman"/>
-          <w:sz w:val="24"/>
-          <w:szCs w:val="24"/>
-        </w:rPr>
-        <w:t>CellBox</w:t>
-      </w:r>
-      <w:proofErr w:type="spellEnd"/>
-      <w:r>
-        <w:rPr>
-          <w:rFonts w:ascii="Times New Roman" w:eastAsia="Times New Roman" w:hAnsi="Times New Roman" w:cs="Times New Roman"/>
-          <w:sz w:val="24"/>
-          <w:szCs w:val="24"/>
-        </w:rPr>
-        <w:t>, the cell is the fundamental unit of scheduling and service. Every scheduling decision grants exactly one cell, which ensures that the service quantum is constant and independent of packet size. This design choice removes packet-size-induced jitter and prevents large packets from monopolizing transmission opportunities. Although cells inherit their parent packet’s weight and flow identifier, they are scheduled independently within the hierarchy.</w:t>
+        <w:pStyle w:val="NormalWeb"/>
+      </w:pPr>
+      <w:r>
+        <w:t xml:space="preserve">Upon arrival, variable-length packets are processed by a </w:t>
+      </w:r>
+      <w:r>
+        <w:rPr>
+          <w:rStyle w:val="Strong"/>
+        </w:rPr>
+        <w:t>Cellization Engine</w:t>
+      </w:r>
+      <w:r>
+        <w:t xml:space="preserve">. This module segments packets into fixed-size cells (denoted as </w:t>
+      </w:r>
+      <w:r>
+        <w:rPr>
+          <w:rStyle w:val="mord"/>
+        </w:rPr>
+        <w:t>S</w:t>
+      </w:r>
+      <w:r>
+        <w:t>). Crucially, the scheduling metadata</w:t>
+      </w:r>
+      <w:r>
+        <w:t xml:space="preserve"> </w:t>
+      </w:r>
+      <w:r>
+        <w:t>including flow weight and calculated virtual departure time</w:t>
+      </w:r>
+      <w:r>
+        <w:t xml:space="preserve"> </w:t>
+      </w:r>
+      <w:r>
+        <w:t>is attached to the head cell of the packet. Subsequent cells in the same packet inherit the flow ID but are scheduled as independent units of transmission. This transformation ensures that the scheduler operates on a uniform time base, where 1 "tick" of virtual time corresponds exactly to the transmission time of one cell (</w:t>
+      </w:r>
+      <w:r>
+        <w:rPr>
+          <w:rStyle w:val="mord"/>
+          <w:i/>
+          <w:iCs/>
+        </w:rPr>
+        <w:t>T</w:t>
+      </w:r>
+      <w:r>
+        <w:rPr>
+          <w:rStyle w:val="mord"/>
+          <w:i/>
+          <w:iCs/>
+        </w:rPr>
+        <w:t>_</w:t>
+      </w:r>
+      <w:r>
+        <w:rPr>
+          <w:rStyle w:val="mord"/>
+          <w:i/>
+          <w:iCs/>
+        </w:rPr>
+        <w:t>cell</w:t>
+      </w:r>
+      <w:r>
+        <w:rPr>
+          <w:rStyle w:val="vlist-s"/>
+        </w:rPr>
+        <w:t>​</w:t>
+      </w:r>
+      <w:r>
+        <w:t>).</w:t>
       </w:r>
     </w:p>
     <w:p>
       <w:pPr>
-        <w:spacing w:before="100" w:beforeAutospacing="1" w:after="100" w:afterAutospacing="1" w:line="240" w:lineRule="auto"/>
-        <w:rPr>
-          <w:rFonts w:ascii="Times New Roman" w:eastAsia="Times New Roman" w:hAnsi="Times New Roman" w:cs="Times New Roman"/>
-          <w:sz w:val="24"/>
-          <w:szCs w:val="24"/>
-        </w:rPr>
-      </w:pPr>
-      <w:r>
-        <w:rPr>
-          <w:rFonts w:ascii="Times New Roman" w:eastAsia="Times New Roman" w:hAnsi="Times New Roman" w:cs="Times New Roman"/>
-          <w:sz w:val="24"/>
-          <w:szCs w:val="24"/>
-        </w:rPr>
-        <w:t>The hierarchical drain-time discipline closely mirrors that of Gearbox. Each level drains a bounded number of cells before deferring service to coarser levels, with a configurable granularity parameter controlling the relative service rates across levels. Because service is measured purely in cells, drain counters advance deterministically, and delay bounds depend only on the hierarchy depth and the cell transmission time rather than on packet size.</w:t>
+        <w:pStyle w:val="Heading4"/>
+      </w:pPr>
+      <w:r>
+        <w:t>3.2 Dynamic Shared Memory Pool</w:t>
       </w:r>
     </w:p>
     <w:p>
       <w:pPr>
-        <w:spacing w:before="100" w:beforeAutospacing="1" w:after="100" w:afterAutospacing="1" w:line="240" w:lineRule="auto"/>
-        <w:rPr>
-          <w:rFonts w:ascii="Times New Roman" w:eastAsia="Times New Roman" w:hAnsi="Times New Roman" w:cs="Times New Roman"/>
-          <w:sz w:val="24"/>
-          <w:szCs w:val="24"/>
-        </w:rPr>
-      </w:pPr>
-      <w:r>
-        <w:rPr>
-          <w:rFonts w:ascii="Times New Roman" w:eastAsia="Times New Roman" w:hAnsi="Times New Roman" w:cs="Times New Roman"/>
-          <w:sz w:val="24"/>
-          <w:szCs w:val="24"/>
-        </w:rPr>
-        <w:t xml:space="preserve">As a result, </w:t>
-      </w:r>
-      <w:proofErr w:type="spellStart"/>
-      <w:r>
-        <w:rPr>
-          <w:rFonts w:ascii="Times New Roman" w:eastAsia="Times New Roman" w:hAnsi="Times New Roman" w:cs="Times New Roman"/>
-          <w:sz w:val="24"/>
-          <w:szCs w:val="24"/>
-        </w:rPr>
-        <w:t>CellBox</w:t>
-      </w:r>
-      <w:proofErr w:type="spellEnd"/>
-      <w:r>
-        <w:rPr>
-          <w:rFonts w:ascii="Times New Roman" w:eastAsia="Times New Roman" w:hAnsi="Times New Roman" w:cs="Times New Roman"/>
-          <w:sz w:val="24"/>
-          <w:szCs w:val="24"/>
-        </w:rPr>
-        <w:t xml:space="preserve"> provides tighter fairness and latency guarantees under mixed workloads. Flows receive service proportional to their weights regardless of packet length, and latency variation caused by heterogeneous packet sizes is effectively eliminated. This leads to more predictable behavior, particularly for latency-sensitive traffic.</w:t>
+        <w:pStyle w:val="NormalWeb"/>
+      </w:pPr>
+      <w:r>
+        <w:t xml:space="preserve">To address memory fragmentation, CellBox replaces static FIFOs with a </w:t>
+      </w:r>
+      <w:r>
+        <w:rPr>
+          <w:rStyle w:val="Strong"/>
+        </w:rPr>
+        <w:t>Dynamic Linked-List Memory Pool</w:t>
+      </w:r>
+      <w:r>
+        <w:t>.</w:t>
       </w:r>
     </w:p>
     <w:p>
       <w:pPr>
-        <w:spacing w:after="0" w:line="240" w:lineRule="auto"/>
-        <w:rPr>
-          <w:rFonts w:ascii="Times New Roman" w:eastAsia="Times New Roman" w:hAnsi="Times New Roman" w:cs="Times New Roman"/>
-          <w:sz w:val="24"/>
-          <w:szCs w:val="24"/>
-        </w:rPr>
-      </w:pPr>
-      <w:r>
-        <w:rPr>
-          <w:rFonts w:ascii="Times New Roman" w:eastAsia="Times New Roman" w:hAnsi="Times New Roman" w:cs="Times New Roman"/>
-          <w:sz w:val="24"/>
-          <w:szCs w:val="24"/>
-        </w:rPr>
-        <w:lastRenderedPageBreak/>
-        <w:pict w14:anchorId="43FE28C2">
-          <v:rect id="_x0000_i1070" style="width:0;height:1.5pt" o:hralign="center" o:hrstd="t" o:hr="t" fillcolor="#a0a0a0" stroked="f"/>
-        </w:pict>
+        <w:numPr>
+          <w:ilvl w:val="0"/>
+          <w:numId w:val="35"/>
+        </w:numPr>
+        <w:spacing w:before="100" w:beforeAutospacing="1" w:after="100" w:afterAutospacing="1" w:line="240" w:lineRule="auto"/>
+      </w:pPr>
+      <w:r>
+        <w:rPr>
+          <w:rStyle w:val="Strong"/>
+        </w:rPr>
+        <w:t>Logical Queues:</w:t>
+      </w:r>
+      <w:r>
+        <w:t xml:space="preserve"> The hierarchy levels (e.g., Level 0, Level 1, Level 2) exist only as logical entities maintained by head and tail pointers.</w:t>
       </w:r>
     </w:p>
     <w:p>
       <w:pPr>
+        <w:numPr>
+          <w:ilvl w:val="0"/>
+          <w:numId w:val="35"/>
+        </w:numPr>
         <w:spacing w:before="100" w:beforeAutospacing="1" w:after="100" w:afterAutospacing="1" w:line="240" w:lineRule="auto"/>
-        <w:outlineLvl w:val="2"/>
-        <w:rPr>
-          <w:rFonts w:ascii="Times New Roman" w:eastAsia="Times New Roman" w:hAnsi="Times New Roman" w:cs="Times New Roman"/>
-          <w:b/>
-          <w:bCs/>
-          <w:sz w:val="27"/>
-          <w:szCs w:val="27"/>
-        </w:rPr>
-      </w:pPr>
-      <w:r>
-        <w:rPr>
-          <w:rFonts w:ascii="Times New Roman" w:eastAsia="Times New Roman" w:hAnsi="Times New Roman" w:cs="Times New Roman"/>
-          <w:b/>
-          <w:bCs/>
-          <w:sz w:val="27"/>
-          <w:szCs w:val="27"/>
-        </w:rPr>
-        <w:t>5. Shared Dynamic Memory Architecture</w:t>
+      </w:pPr>
+      <w:r>
+        <w:rPr>
+          <w:rStyle w:val="Strong"/>
+        </w:rPr>
+        <w:t>Unified Storage:</w:t>
+      </w:r>
+      <w:r>
+        <w:t xml:space="preserve"> All cell data is stored in a single, global SRAM block.</w:t>
       </w:r>
     </w:p>
     <w:p>
       <w:pPr>
+        <w:numPr>
+          <w:ilvl w:val="0"/>
+          <w:numId w:val="35"/>
+        </w:numPr>
         <w:spacing w:before="100" w:beforeAutospacing="1" w:after="100" w:afterAutospacing="1" w:line="240" w:lineRule="auto"/>
-        <w:rPr>
-          <w:rFonts w:ascii="Times New Roman" w:eastAsia="Times New Roman" w:hAnsi="Times New Roman" w:cs="Times New Roman"/>
-          <w:sz w:val="24"/>
-          <w:szCs w:val="24"/>
-        </w:rPr>
-      </w:pPr>
-      <w:r>
-        <w:rPr>
-          <w:rFonts w:ascii="Times New Roman" w:eastAsia="Times New Roman" w:hAnsi="Times New Roman" w:cs="Times New Roman"/>
-          <w:sz w:val="24"/>
-          <w:szCs w:val="24"/>
-        </w:rPr>
-        <w:t xml:space="preserve">Static buffer partitioning forces designers to allocate memory based on worst-case assumptions at each hierarchy level, even though such worst cases rarely occur simultaneously. </w:t>
-      </w:r>
-      <w:proofErr w:type="spellStart"/>
-      <w:r>
-        <w:rPr>
-          <w:rFonts w:ascii="Times New Roman" w:eastAsia="Times New Roman" w:hAnsi="Times New Roman" w:cs="Times New Roman"/>
-          <w:sz w:val="24"/>
-          <w:szCs w:val="24"/>
-        </w:rPr>
-        <w:t>CellBox</w:t>
-      </w:r>
-      <w:proofErr w:type="spellEnd"/>
-      <w:r>
-        <w:rPr>
-          <w:rFonts w:ascii="Times New Roman" w:eastAsia="Times New Roman" w:hAnsi="Times New Roman" w:cs="Times New Roman"/>
-          <w:sz w:val="24"/>
-          <w:szCs w:val="24"/>
-        </w:rPr>
-        <w:t xml:space="preserve"> replaces this rigid structure with a unified memory pool that dynamically adapts to traffic demands across the entire hierarchy.</w:t>
+      </w:pPr>
+      <w:r>
+        <w:rPr>
+          <w:rStyle w:val="Strong"/>
+        </w:rPr>
+        <w:t>Dynamic Allocation:</w:t>
+      </w:r>
+      <w:r>
+        <w:t xml:space="preserve"> When a cell arrives, a free buffer ID is popped from a free-list stack. This buffer is linked to the tail of the appropriate logical level queue. When a cell is transmitted, its buffer ID is returned to the free list.</w:t>
       </w:r>
     </w:p>
     <w:p>
       <w:pPr>
-        <w:spacing w:before="100" w:beforeAutospacing="1" w:after="100" w:afterAutospacing="1" w:line="240" w:lineRule="auto"/>
-        <w:rPr>
-          <w:rFonts w:ascii="Times New Roman" w:eastAsia="Times New Roman" w:hAnsi="Times New Roman" w:cs="Times New Roman"/>
-          <w:sz w:val="24"/>
-          <w:szCs w:val="24"/>
-        </w:rPr>
-      </w:pPr>
-      <w:r>
-        <w:rPr>
-          <w:rFonts w:ascii="Times New Roman" w:eastAsia="Times New Roman" w:hAnsi="Times New Roman" w:cs="Times New Roman"/>
-          <w:sz w:val="24"/>
-          <w:szCs w:val="24"/>
-        </w:rPr>
-        <w:t xml:space="preserve">Each logical queue in </w:t>
-      </w:r>
-      <w:proofErr w:type="spellStart"/>
-      <w:r>
-        <w:rPr>
-          <w:rFonts w:ascii="Times New Roman" w:eastAsia="Times New Roman" w:hAnsi="Times New Roman" w:cs="Times New Roman"/>
-          <w:sz w:val="24"/>
-          <w:szCs w:val="24"/>
-        </w:rPr>
-        <w:t>CellBox</w:t>
-      </w:r>
-      <w:proofErr w:type="spellEnd"/>
-      <w:r>
-        <w:rPr>
-          <w:rFonts w:ascii="Times New Roman" w:eastAsia="Times New Roman" w:hAnsi="Times New Roman" w:cs="Times New Roman"/>
-          <w:sz w:val="24"/>
-          <w:szCs w:val="24"/>
-        </w:rPr>
-        <w:t xml:space="preserve"> is implemented as a linked list of cell buffers drawn from the shared pool. Per-queue head and tail pointers track active cells, while free buffers are managed globally. This approach allows buffer resources to flow naturally between hierarchy levels as traffic conditions change, providing efficient support for </w:t>
-      </w:r>
-      <w:proofErr w:type="spellStart"/>
-      <w:r>
-        <w:rPr>
-          <w:rFonts w:ascii="Times New Roman" w:eastAsia="Times New Roman" w:hAnsi="Times New Roman" w:cs="Times New Roman"/>
-          <w:sz w:val="24"/>
-          <w:szCs w:val="24"/>
-        </w:rPr>
-        <w:t>bursty</w:t>
-      </w:r>
-      <w:proofErr w:type="spellEnd"/>
-      <w:r>
-        <w:rPr>
-          <w:rFonts w:ascii="Times New Roman" w:eastAsia="Times New Roman" w:hAnsi="Times New Roman" w:cs="Times New Roman"/>
-          <w:sz w:val="24"/>
-          <w:szCs w:val="24"/>
-        </w:rPr>
-        <w:t xml:space="preserve"> and uneven workloads.</w:t>
+        <w:pStyle w:val="NormalWeb"/>
+      </w:pPr>
+      <w:r>
+        <w:t>This architecture allows memory allocation to follow traffic demand implicitly. If traffic is dominated by Level 2 flows, the shared pool naturally dedicates the majority of resources to Level 2, avoiding the waste inherent in static partitioning.</w:t>
       </w:r>
     </w:p>
     <w:p>
       <w:pPr>
-        <w:spacing w:before="100" w:beforeAutospacing="1" w:after="100" w:afterAutospacing="1" w:line="240" w:lineRule="auto"/>
-        <w:rPr>
-          <w:rFonts w:ascii="Times New Roman" w:eastAsia="Times New Roman" w:hAnsi="Times New Roman" w:cs="Times New Roman"/>
-          <w:sz w:val="24"/>
-          <w:szCs w:val="24"/>
-        </w:rPr>
-      </w:pPr>
-      <w:r>
-        <w:rPr>
-          <w:rFonts w:ascii="Times New Roman" w:eastAsia="Times New Roman" w:hAnsi="Times New Roman" w:cs="Times New Roman"/>
-          <w:sz w:val="24"/>
-          <w:szCs w:val="24"/>
-        </w:rPr>
-        <w:t xml:space="preserve">By enabling buffers to migrate implicitly across levels, </w:t>
-      </w:r>
-      <w:proofErr w:type="spellStart"/>
-      <w:r>
-        <w:rPr>
-          <w:rFonts w:ascii="Times New Roman" w:eastAsia="Times New Roman" w:hAnsi="Times New Roman" w:cs="Times New Roman"/>
-          <w:sz w:val="24"/>
-          <w:szCs w:val="24"/>
-        </w:rPr>
-        <w:t>CellBox</w:t>
-      </w:r>
-      <w:proofErr w:type="spellEnd"/>
-      <w:r>
-        <w:rPr>
-          <w:rFonts w:ascii="Times New Roman" w:eastAsia="Times New Roman" w:hAnsi="Times New Roman" w:cs="Times New Roman"/>
-          <w:sz w:val="24"/>
-          <w:szCs w:val="24"/>
-        </w:rPr>
-        <w:t xml:space="preserve"> achieves the benefits of statistical multiplexing that are impossible with static partitioning. Memory provisioning scales with actual aggregate demand rather than with the sum of per-level worst-case requirements, resulting in significantly improved utilization, especially in deep hierarchies with variable traffic patterns.</w:t>
+        <w:pStyle w:val="Heading4"/>
+      </w:pPr>
+      <w:r>
+        <w:t>3.3 Hierarchical Cell Scheduler</w:t>
       </w:r>
     </w:p>
     <w:p>
       <w:pPr>
-        <w:spacing w:after="0" w:line="240" w:lineRule="auto"/>
-        <w:rPr>
-          <w:rFonts w:ascii="Times New Roman" w:eastAsia="Times New Roman" w:hAnsi="Times New Roman" w:cs="Times New Roman"/>
-          <w:sz w:val="24"/>
-          <w:szCs w:val="24"/>
-        </w:rPr>
-      </w:pPr>
-      <w:r>
-        <w:rPr>
-          <w:rFonts w:ascii="Times New Roman" w:eastAsia="Times New Roman" w:hAnsi="Times New Roman" w:cs="Times New Roman"/>
-          <w:sz w:val="24"/>
-          <w:szCs w:val="24"/>
-        </w:rPr>
-        <w:pict w14:anchorId="086E7B83">
-          <v:rect id="_x0000_i1071" style="width:0;height:1.5pt" o:hralign="center" o:hrstd="t" o:hr="t" fillcolor="#a0a0a0" stroked="f"/>
-        </w:pict>
+        <w:pStyle w:val="NormalWeb"/>
+      </w:pPr>
+      <w:r>
+        <w:t xml:space="preserve">The core logic of CellBox adapts the "Compound FIFO" discipline of Gearbox to cells. The scheduler maintains </w:t>
+      </w:r>
+      <w:r>
+        <w:rPr>
+          <w:rStyle w:val="katex-mathml"/>
+          <w:i/>
+          <w:iCs/>
+        </w:rPr>
+        <w:t>L</w:t>
+      </w:r>
+      <w:r>
+        <w:t xml:space="preserve"> logical queues.</w:t>
       </w:r>
     </w:p>
     <w:p>
       <w:pPr>
+        <w:numPr>
+          <w:ilvl w:val="0"/>
+          <w:numId w:val="36"/>
+        </w:numPr>
         <w:spacing w:before="100" w:beforeAutospacing="1" w:after="100" w:afterAutospacing="1" w:line="240" w:lineRule="auto"/>
-        <w:outlineLvl w:val="2"/>
-        <w:rPr>
-          <w:rFonts w:ascii="Times New Roman" w:eastAsia="Times New Roman" w:hAnsi="Times New Roman" w:cs="Times New Roman"/>
-          <w:b/>
-          <w:bCs/>
-          <w:sz w:val="27"/>
-          <w:szCs w:val="27"/>
-        </w:rPr>
-      </w:pPr>
-      <w:r>
-        <w:rPr>
-          <w:rFonts w:ascii="Times New Roman" w:eastAsia="Times New Roman" w:hAnsi="Times New Roman" w:cs="Times New Roman"/>
-          <w:b/>
-          <w:bCs/>
-          <w:sz w:val="27"/>
-          <w:szCs w:val="27"/>
-        </w:rPr>
-        <w:t>6. Analytical Properties</w:t>
+      </w:pPr>
+      <w:r>
+        <w:rPr>
+          <w:rStyle w:val="Strong"/>
+        </w:rPr>
+        <w:lastRenderedPageBreak/>
+        <w:t>Service Quantum:</w:t>
+      </w:r>
+      <w:r>
+        <w:t xml:space="preserve"> The scheduler grants service slots to cells. Because all cells are size </w:t>
+      </w:r>
+      <w:r>
+        <w:rPr>
+          <w:rStyle w:val="katex-mathml"/>
+        </w:rPr>
+        <w:t>SS</w:t>
+      </w:r>
+      <w:r>
+        <w:rPr>
+          <w:rStyle w:val="mord"/>
+        </w:rPr>
+        <w:t>S</w:t>
+      </w:r>
+      <w:r>
+        <w:t>, the service quantum is constant.</w:t>
       </w:r>
     </w:p>
     <w:p>
       <w:pPr>
+        <w:numPr>
+          <w:ilvl w:val="0"/>
+          <w:numId w:val="36"/>
+        </w:numPr>
         <w:spacing w:before="100" w:beforeAutospacing="1" w:after="100" w:afterAutospacing="1" w:line="240" w:lineRule="auto"/>
-        <w:rPr>
-          <w:rFonts w:ascii="Times New Roman" w:eastAsia="Times New Roman" w:hAnsi="Times New Roman" w:cs="Times New Roman"/>
-          <w:sz w:val="24"/>
-          <w:szCs w:val="24"/>
-        </w:rPr>
-      </w:pPr>
-      <w:r>
-        <w:rPr>
-          <w:rFonts w:ascii="Times New Roman" w:eastAsia="Times New Roman" w:hAnsi="Times New Roman" w:cs="Times New Roman"/>
-          <w:sz w:val="24"/>
-          <w:szCs w:val="24"/>
-        </w:rPr>
-        <w:t xml:space="preserve">The analytical properties of </w:t>
-      </w:r>
-      <w:proofErr w:type="spellStart"/>
-      <w:r>
-        <w:rPr>
-          <w:rFonts w:ascii="Times New Roman" w:eastAsia="Times New Roman" w:hAnsi="Times New Roman" w:cs="Times New Roman"/>
-          <w:sz w:val="24"/>
-          <w:szCs w:val="24"/>
-        </w:rPr>
-        <w:t>CellBox</w:t>
-      </w:r>
-      <w:proofErr w:type="spellEnd"/>
-      <w:r>
-        <w:rPr>
-          <w:rFonts w:ascii="Times New Roman" w:eastAsia="Times New Roman" w:hAnsi="Times New Roman" w:cs="Times New Roman"/>
-          <w:sz w:val="24"/>
-          <w:szCs w:val="24"/>
-        </w:rPr>
-        <w:t xml:space="preserve"> reflect its cell-based design. If the transmission time of a single cell is denoted as (T_{cell}), then in a hierarchy of depth (L), the maximum departure-time discrepancy is bounded by ((L - 1) \</w:t>
-      </w:r>
-      <w:proofErr w:type="spellStart"/>
-      <w:r>
-        <w:rPr>
-          <w:rFonts w:ascii="Times New Roman" w:eastAsia="Times New Roman" w:hAnsi="Times New Roman" w:cs="Times New Roman"/>
-          <w:sz w:val="24"/>
-          <w:szCs w:val="24"/>
-        </w:rPr>
-        <w:t>cdot</w:t>
-      </w:r>
-      <w:proofErr w:type="spellEnd"/>
-      <w:r>
-        <w:rPr>
-          <w:rFonts w:ascii="Times New Roman" w:eastAsia="Times New Roman" w:hAnsi="Times New Roman" w:cs="Times New Roman"/>
-          <w:sz w:val="24"/>
-          <w:szCs w:val="24"/>
-        </w:rPr>
-        <w:t xml:space="preserve"> T_{cell}). This bound is independent of packet size and is strictly tighter than the bounds of packet-granular schedulers, which scale with the maximum packet transmission time.</w:t>
+      </w:pPr>
+      <w:r>
+        <w:rPr>
+          <w:rStyle w:val="Strong"/>
+        </w:rPr>
+        <w:t>Drain Logic:</w:t>
+      </w:r>
+      <w:r>
+        <w:t xml:space="preserve"> The scheduler prioritizes finer levels (Level 0) but periodically services coarser levels (Level 1, 2) based on a configurable granularity factor </w:t>
+      </w:r>
+      <w:r>
+        <w:rPr>
+          <w:rStyle w:val="mord"/>
+        </w:rPr>
+        <w:t>g</w:t>
+      </w:r>
+      <w:r>
+        <w:t xml:space="preserve">. For example, it may drain </w:t>
+      </w:r>
+      <w:r>
+        <w:rPr>
+          <w:rStyle w:val="mord"/>
+        </w:rPr>
+        <w:t>g</w:t>
+      </w:r>
+      <w:r>
+        <w:t xml:space="preserve"> cells from Level 0 for every 1 cell drained from Level 1.</w:t>
       </w:r>
     </w:p>
     <w:p>
       <w:pPr>
+        <w:numPr>
+          <w:ilvl w:val="0"/>
+          <w:numId w:val="36"/>
+        </w:numPr>
         <w:spacing w:before="100" w:beforeAutospacing="1" w:after="100" w:afterAutospacing="1" w:line="240" w:lineRule="auto"/>
-        <w:rPr>
-          <w:rFonts w:ascii="Times New Roman" w:eastAsia="Times New Roman" w:hAnsi="Times New Roman" w:cs="Times New Roman"/>
-          <w:sz w:val="24"/>
-          <w:szCs w:val="24"/>
-        </w:rPr>
-      </w:pPr>
-      <w:r>
-        <w:rPr>
-          <w:rFonts w:ascii="Times New Roman" w:eastAsia="Times New Roman" w:hAnsi="Times New Roman" w:cs="Times New Roman"/>
-          <w:sz w:val="24"/>
-          <w:szCs w:val="24"/>
-        </w:rPr>
-        <w:t xml:space="preserve">Memory utilization can also be analyzed more favorably under the shared-memory model. In statically partitioned designs, total buffer memory is the sum of worst-case requirements across all hierarchy levels. In </w:t>
-      </w:r>
-      <w:proofErr w:type="spellStart"/>
-      <w:r>
-        <w:rPr>
-          <w:rFonts w:ascii="Times New Roman" w:eastAsia="Times New Roman" w:hAnsi="Times New Roman" w:cs="Times New Roman"/>
-          <w:sz w:val="24"/>
-          <w:szCs w:val="24"/>
-        </w:rPr>
-        <w:t>CellBox</w:t>
-      </w:r>
-      <w:proofErr w:type="spellEnd"/>
-      <w:r>
-        <w:rPr>
-          <w:rFonts w:ascii="Times New Roman" w:eastAsia="Times New Roman" w:hAnsi="Times New Roman" w:cs="Times New Roman"/>
-          <w:sz w:val="24"/>
-          <w:szCs w:val="24"/>
-        </w:rPr>
-        <w:t xml:space="preserve">, required memory instead approaches the maximum concurrent occupancy across levels. The advantage of this approach grows with both hierarchy depth and traffic variability, making </w:t>
-      </w:r>
-      <w:proofErr w:type="spellStart"/>
-      <w:r>
-        <w:rPr>
-          <w:rFonts w:ascii="Times New Roman" w:eastAsia="Times New Roman" w:hAnsi="Times New Roman" w:cs="Times New Roman"/>
-          <w:sz w:val="24"/>
-          <w:szCs w:val="24"/>
-        </w:rPr>
-        <w:t>CellBox</w:t>
-      </w:r>
-      <w:proofErr w:type="spellEnd"/>
-      <w:r>
-        <w:rPr>
-          <w:rFonts w:ascii="Times New Roman" w:eastAsia="Times New Roman" w:hAnsi="Times New Roman" w:cs="Times New Roman"/>
-          <w:sz w:val="24"/>
-          <w:szCs w:val="24"/>
-        </w:rPr>
-        <w:t xml:space="preserve"> particularly attractive for large, heterogeneous systems.</w:t>
+      </w:pPr>
+      <w:r>
+        <w:rPr>
+          <w:rStyle w:val="Strong"/>
+        </w:rPr>
+        <w:t>Granularity Smoothing:</w:t>
+      </w:r>
+      <w:r>
+        <w:t xml:space="preserve"> In packet-based systems, draining a "packet" from Level 1 could block Level 0 for a long time (if the packet is large). In CellBox, draining a "cell" from Level 1 incurs only a tiny, fixed penalty </w:t>
+      </w:r>
+      <w:r>
+        <w:rPr>
+          <w:i/>
+          <w:iCs/>
+        </w:rPr>
+        <w:t>(</w:t>
+      </w:r>
+      <w:r>
+        <w:rPr>
+          <w:rStyle w:val="mord"/>
+          <w:i/>
+          <w:iCs/>
+        </w:rPr>
+        <w:t>T</w:t>
+      </w:r>
+      <w:r>
+        <w:rPr>
+          <w:rStyle w:val="mord"/>
+          <w:i/>
+          <w:iCs/>
+        </w:rPr>
+        <w:t>_</w:t>
+      </w:r>
+      <w:r>
+        <w:rPr>
+          <w:rStyle w:val="mord"/>
+          <w:i/>
+          <w:iCs/>
+        </w:rPr>
+        <w:t>cell</w:t>
+      </w:r>
+      <w:r>
+        <w:rPr>
+          <w:rStyle w:val="vlist-s"/>
+        </w:rPr>
+        <w:t>​</w:t>
+      </w:r>
+      <w:r>
+        <w:rPr>
+          <w:i/>
+          <w:iCs/>
+        </w:rPr>
+        <w:t>)</w:t>
+      </w:r>
+      <w:r>
+        <w:t>, significantly reducing the blocking time seen by high-priority traffic.</w:t>
       </w:r>
     </w:p>
     <w:p>
       <w:pPr>
-        <w:spacing w:before="100" w:beforeAutospacing="1" w:after="100" w:afterAutospacing="1" w:line="240" w:lineRule="auto"/>
-        <w:rPr>
-          <w:rFonts w:ascii="Times New Roman" w:eastAsia="Times New Roman" w:hAnsi="Times New Roman" w:cs="Times New Roman"/>
-          <w:sz w:val="24"/>
-          <w:szCs w:val="24"/>
-        </w:rPr>
-      </w:pPr>
-      <w:r>
-        <w:rPr>
-          <w:rFonts w:ascii="Times New Roman" w:eastAsia="Times New Roman" w:hAnsi="Times New Roman" w:cs="Times New Roman"/>
-          <w:sz w:val="24"/>
-          <w:szCs w:val="24"/>
-        </w:rPr>
-        <w:t xml:space="preserve">From a hardware perspective, </w:t>
-      </w:r>
-      <w:proofErr w:type="spellStart"/>
-      <w:r>
-        <w:rPr>
-          <w:rFonts w:ascii="Times New Roman" w:eastAsia="Times New Roman" w:hAnsi="Times New Roman" w:cs="Times New Roman"/>
-          <w:sz w:val="24"/>
-          <w:szCs w:val="24"/>
-        </w:rPr>
-        <w:t>CellBox</w:t>
-      </w:r>
-      <w:proofErr w:type="spellEnd"/>
-      <w:r>
-        <w:rPr>
-          <w:rFonts w:ascii="Times New Roman" w:eastAsia="Times New Roman" w:hAnsi="Times New Roman" w:cs="Times New Roman"/>
-          <w:sz w:val="24"/>
-          <w:szCs w:val="24"/>
-        </w:rPr>
-        <w:t xml:space="preserve"> preserves constant-time enqueue and dequeue operations. The additional complexity introduced by cell segmentation and linked-list management maps naturally onto FPGA and ASIC primitives and does not compromise throughput or timing.</w:t>
+        <w:spacing w:after="0"/>
+      </w:pPr>
+      <w:r>
+        <w:pict w14:anchorId="63C8C35F">
+          <v:rect id="_x0000_i1029" style="width:0;height:1.5pt" o:hralign="center" o:hrstd="t" o:hr="t" fillcolor="#a0a0a0" stroked="f"/>
+        </w:pict>
       </w:r>
     </w:p>
     <w:p>
       <w:pPr>
-        <w:spacing w:after="0" w:line="240" w:lineRule="auto"/>
-        <w:rPr>
-          <w:rFonts w:ascii="Times New Roman" w:eastAsia="Times New Roman" w:hAnsi="Times New Roman" w:cs="Times New Roman"/>
-          <w:sz w:val="24"/>
-          <w:szCs w:val="24"/>
-        </w:rPr>
-      </w:pPr>
-      <w:r>
-        <w:rPr>
-          <w:rFonts w:ascii="Times New Roman" w:eastAsia="Times New Roman" w:hAnsi="Times New Roman" w:cs="Times New Roman"/>
-          <w:sz w:val="24"/>
-          <w:szCs w:val="24"/>
-        </w:rPr>
-        <w:pict w14:anchorId="11850CAF">
-          <v:rect id="_x0000_i1072" style="width:0;height:1.5pt" o:hralign="center" o:hrstd="t" o:hr="t" fillcolor="#a0a0a0" stroked="f"/>
-        </w:pict>
+        <w:pStyle w:val="Heading3"/>
+      </w:pPr>
+      <w:r>
+        <w:t>4. Analytical Model</w:t>
       </w:r>
     </w:p>
     <w:p>
       <w:pPr>
-        <w:spacing w:before="100" w:beforeAutospacing="1" w:after="100" w:afterAutospacing="1" w:line="240" w:lineRule="auto"/>
-        <w:outlineLvl w:val="2"/>
-        <w:rPr>
-          <w:rFonts w:ascii="Times New Roman" w:eastAsia="Times New Roman" w:hAnsi="Times New Roman" w:cs="Times New Roman"/>
-          <w:b/>
-          <w:bCs/>
-          <w:sz w:val="27"/>
-          <w:szCs w:val="27"/>
-        </w:rPr>
-      </w:pPr>
-      <w:r>
-        <w:rPr>
-          <w:rFonts w:ascii="Times New Roman" w:eastAsia="Times New Roman" w:hAnsi="Times New Roman" w:cs="Times New Roman"/>
-          <w:b/>
-          <w:bCs/>
-          <w:sz w:val="27"/>
-          <w:szCs w:val="27"/>
-        </w:rPr>
-        <w:t>7. Implementation Considerations</w:t>
+        <w:pStyle w:val="NormalWeb"/>
+      </w:pPr>
+      <w:r>
+        <w:t>We analyze the theoretical properties of CellBox to demonstrate its advantages over packet-based hierarchical schedulers.</w:t>
       </w:r>
     </w:p>
     <w:p>
       <w:pPr>
-        <w:spacing w:before="100" w:beforeAutospacing="1" w:after="100" w:afterAutospacing="1" w:line="240" w:lineRule="auto"/>
-        <w:rPr>
-          <w:rFonts w:ascii="Times New Roman" w:eastAsia="Times New Roman" w:hAnsi="Times New Roman" w:cs="Times New Roman"/>
-          <w:sz w:val="24"/>
-          <w:szCs w:val="24"/>
-        </w:rPr>
-      </w:pPr>
-      <w:proofErr w:type="spellStart"/>
-      <w:r>
-        <w:rPr>
-          <w:rFonts w:ascii="Times New Roman" w:eastAsia="Times New Roman" w:hAnsi="Times New Roman" w:cs="Times New Roman"/>
-          <w:sz w:val="24"/>
-          <w:szCs w:val="24"/>
-        </w:rPr>
-        <w:lastRenderedPageBreak/>
-        <w:t>CellBox</w:t>
-      </w:r>
-      <w:proofErr w:type="spellEnd"/>
-      <w:r>
-        <w:rPr>
-          <w:rFonts w:ascii="Times New Roman" w:eastAsia="Times New Roman" w:hAnsi="Times New Roman" w:cs="Times New Roman"/>
-          <w:sz w:val="24"/>
-          <w:szCs w:val="24"/>
-        </w:rPr>
-        <w:t xml:space="preserve"> is designed to integrate cleanly into existing programmable switch fabrics. It can replace traditional QoS schedulers without requiring changes to upstream or downstream pipeline stages and interfaces naturally with shared memory subsystems and control planes.</w:t>
+        <w:pStyle w:val="Heading4"/>
+      </w:pPr>
+      <w:r>
+        <w:t>4.1 Delay Bound Analysis</w:t>
       </w:r>
     </w:p>
     <w:p>
       <w:pPr>
-        <w:spacing w:before="100" w:beforeAutospacing="1" w:after="100" w:afterAutospacing="1" w:line="240" w:lineRule="auto"/>
-        <w:rPr>
-          <w:rFonts w:ascii="Times New Roman" w:eastAsia="Times New Roman" w:hAnsi="Times New Roman" w:cs="Times New Roman"/>
-          <w:sz w:val="24"/>
-          <w:szCs w:val="24"/>
-        </w:rPr>
-      </w:pPr>
-      <w:r>
-        <w:rPr>
-          <w:rFonts w:ascii="Times New Roman" w:eastAsia="Times New Roman" w:hAnsi="Times New Roman" w:cs="Times New Roman"/>
-          <w:sz w:val="24"/>
-          <w:szCs w:val="24"/>
-        </w:rPr>
-        <w:t>Key design parameters, including cell size, hierarchy depth, and scheduling granularity, are exposed through a control interface. This allows operators to tune the scheduler at runtime to match workload characteristics without redesigning hardware. Cells are reassembled into packets only after scheduling decisions are complete, ensuring that downstream components remain unaware of the internal cell-based operation.</w:t>
+        <w:pStyle w:val="NormalWeb"/>
+      </w:pPr>
+      <w:r>
+        <w:t xml:space="preserve">In a hierarchical scheduler with depth </w:t>
+      </w:r>
+      <w:r>
+        <w:rPr>
+          <w:rStyle w:val="katex-mathml"/>
+          <w:i/>
+          <w:iCs/>
+        </w:rPr>
+        <w:t>L</w:t>
+      </w:r>
+      <w:r>
+        <w:t>, a packet (or cell) may be deferred to a coarser level and must migrate back down to Level 0 for transmission.</w:t>
       </w:r>
     </w:p>
     <w:p>
       <w:pPr>
-        <w:spacing w:after="0" w:line="240" w:lineRule="auto"/>
-        <w:rPr>
-          <w:rFonts w:ascii="Times New Roman" w:eastAsia="Times New Roman" w:hAnsi="Times New Roman" w:cs="Times New Roman"/>
-          <w:sz w:val="24"/>
-          <w:szCs w:val="24"/>
-        </w:rPr>
-      </w:pPr>
-      <w:r>
-        <w:rPr>
-          <w:rFonts w:ascii="Times New Roman" w:eastAsia="Times New Roman" w:hAnsi="Times New Roman" w:cs="Times New Roman"/>
-          <w:sz w:val="24"/>
-          <w:szCs w:val="24"/>
-        </w:rPr>
-        <w:pict w14:anchorId="384462FA">
-          <v:rect id="_x0000_i1073" style="width:0;height:1.5pt" o:hralign="center" o:hrstd="t" o:hr="t" fillcolor="#a0a0a0" stroked="f"/>
-        </w:pict>
+        <w:spacing w:before="100" w:beforeAutospacing="1" w:after="100" w:afterAutospacing="1" w:line="240" w:lineRule="auto"/>
+      </w:pPr>
+      <w:r>
+        <w:rPr>
+          <w:rStyle w:val="Strong"/>
+        </w:rPr>
+        <w:t>Packet-Based Bound:</w:t>
+      </w:r>
+      <w:r>
+        <w:t xml:space="preserve"> In Gearbox, the maximum departure time discrepancy is bounded by </w:t>
       </w:r>
     </w:p>
     <w:p>
       <w:pPr>
         <w:spacing w:before="100" w:beforeAutospacing="1" w:after="100" w:afterAutospacing="1" w:line="240" w:lineRule="auto"/>
-        <w:outlineLvl w:val="2"/>
-        <w:rPr>
-          <w:rFonts w:ascii="Times New Roman" w:eastAsia="Times New Roman" w:hAnsi="Times New Roman" w:cs="Times New Roman"/>
-          <w:b/>
-          <w:bCs/>
-          <w:sz w:val="27"/>
-          <w:szCs w:val="27"/>
-        </w:rPr>
-      </w:pPr>
-      <w:r>
-        <w:rPr>
-          <w:rFonts w:ascii="Times New Roman" w:eastAsia="Times New Roman" w:hAnsi="Times New Roman" w:cs="Times New Roman"/>
-          <w:b/>
-          <w:bCs/>
-          <w:sz w:val="27"/>
-          <w:szCs w:val="27"/>
-        </w:rPr>
-        <w:t>8. Related Work</w:t>
+        <w:jc w:val="center"/>
+      </w:pPr>
+      <w:r>
+        <w:rPr>
+          <w:rStyle w:val="katex-mathml"/>
+          <w:i/>
+          <w:iCs/>
+        </w:rPr>
+        <w:t>(</w:t>
+      </w:r>
+      <w:r>
+        <w:rPr>
+          <w:rStyle w:val="mord"/>
+          <w:i/>
+          <w:iCs/>
+        </w:rPr>
+        <w:t>L</w:t>
+      </w:r>
+      <w:r>
+        <w:rPr>
+          <w:rStyle w:val="mbin"/>
+          <w:i/>
+          <w:iCs/>
+        </w:rPr>
+        <w:t>−</w:t>
+      </w:r>
+      <w:r>
+        <w:rPr>
+          <w:rStyle w:val="mord"/>
+          <w:i/>
+          <w:iCs/>
+        </w:rPr>
+        <w:t>1</w:t>
+      </w:r>
+      <w:r>
+        <w:rPr>
+          <w:rStyle w:val="mclose"/>
+          <w:i/>
+          <w:iCs/>
+        </w:rPr>
+        <w:t>)</w:t>
+      </w:r>
+      <w:r>
+        <w:rPr>
+          <w:rStyle w:val="mbin"/>
+          <w:rFonts w:ascii="Cambria Math" w:hAnsi="Cambria Math" w:cs="Cambria Math"/>
+          <w:i/>
+          <w:iCs/>
+        </w:rPr>
+        <w:t>⋅</w:t>
+      </w:r>
+      <w:r>
+        <w:rPr>
+          <w:rStyle w:val="mord"/>
+          <w:i/>
+          <w:iCs/>
+        </w:rPr>
+        <w:t>Tmax_pkt</w:t>
+      </w:r>
+      <w:r>
+        <w:rPr>
+          <w:rStyle w:val="vlist-s"/>
+          <w:i/>
+          <w:iCs/>
+        </w:rPr>
+        <w:t>​</w:t>
+      </w:r>
+      <w:r>
+        <w:rPr>
+          <w:i/>
+          <w:iCs/>
+        </w:rPr>
+        <w:t>.</w:t>
       </w:r>
     </w:p>
     <w:p>
       <w:pPr>
         <w:spacing w:before="100" w:beforeAutospacing="1" w:after="100" w:afterAutospacing="1" w:line="240" w:lineRule="auto"/>
-        <w:rPr>
-          <w:rFonts w:ascii="Times New Roman" w:eastAsia="Times New Roman" w:hAnsi="Times New Roman" w:cs="Times New Roman"/>
-          <w:sz w:val="24"/>
-          <w:szCs w:val="24"/>
-        </w:rPr>
-      </w:pPr>
-      <w:proofErr w:type="spellStart"/>
-      <w:r>
-        <w:rPr>
-          <w:rFonts w:ascii="Times New Roman" w:eastAsia="Times New Roman" w:hAnsi="Times New Roman" w:cs="Times New Roman"/>
-          <w:sz w:val="24"/>
-          <w:szCs w:val="24"/>
-        </w:rPr>
-        <w:t>CellBox</w:t>
-      </w:r>
-      <w:proofErr w:type="spellEnd"/>
-      <w:r>
-        <w:rPr>
-          <w:rFonts w:ascii="Times New Roman" w:eastAsia="Times New Roman" w:hAnsi="Times New Roman" w:cs="Times New Roman"/>
-          <w:sz w:val="24"/>
-          <w:szCs w:val="24"/>
-        </w:rPr>
-        <w:t xml:space="preserve"> builds on prior research in hierarchical scheduling, shared-memory switching, and cell-based fabrics. While hierarchical schedulers such as Gearbox approximate weighted fair queuing efficiently, and shared-memory designs improve buffer utilization, prior work has not combined these techniques with cell-granular scheduling in a single hardware-oriented architecture. To the best of our knowledge, </w:t>
-      </w:r>
-      <w:proofErr w:type="spellStart"/>
-      <w:r>
-        <w:rPr>
-          <w:rFonts w:ascii="Times New Roman" w:eastAsia="Times New Roman" w:hAnsi="Times New Roman" w:cs="Times New Roman"/>
-          <w:sz w:val="24"/>
-          <w:szCs w:val="24"/>
-        </w:rPr>
-        <w:t>CellBox</w:t>
-      </w:r>
-      <w:proofErr w:type="spellEnd"/>
-      <w:r>
-        <w:rPr>
-          <w:rFonts w:ascii="Times New Roman" w:eastAsia="Times New Roman" w:hAnsi="Times New Roman" w:cs="Times New Roman"/>
-          <w:sz w:val="24"/>
-          <w:szCs w:val="24"/>
-        </w:rPr>
-        <w:t xml:space="preserve"> is the first design to unify these ideas in a cohesive and practical system.</w:t>
+      </w:pPr>
+      <w:r>
+        <w:t xml:space="preserve">For a 9KB jumbo frame at 100Gbps, </w:t>
       </w:r>
     </w:p>
     <w:p>
       <w:pPr>
-        <w:spacing w:after="0" w:line="240" w:lineRule="auto"/>
-        <w:rPr>
-          <w:rFonts w:ascii="Times New Roman" w:eastAsia="Times New Roman" w:hAnsi="Times New Roman" w:cs="Times New Roman"/>
-          <w:sz w:val="24"/>
-          <w:szCs w:val="24"/>
-        </w:rPr>
-      </w:pPr>
-      <w:r>
-        <w:rPr>
-          <w:rFonts w:ascii="Times New Roman" w:eastAsia="Times New Roman" w:hAnsi="Times New Roman" w:cs="Times New Roman"/>
-          <w:sz w:val="24"/>
-          <w:szCs w:val="24"/>
-        </w:rPr>
-        <w:pict w14:anchorId="3295DCA6">
-          <v:rect id="_x0000_i1074" style="width:0;height:1.5pt" o:hralign="center" o:hrstd="t" o:hr="t" fillcolor="#a0a0a0" stroked="f"/>
-        </w:pict>
+        <w:spacing w:before="100" w:beforeAutospacing="1" w:after="100" w:afterAutospacing="1" w:line="240" w:lineRule="auto"/>
+        <w:jc w:val="center"/>
+        <w:rPr>
+          <w:i/>
+          <w:iCs/>
+        </w:rPr>
+      </w:pPr>
+      <w:r>
+        <w:rPr>
+          <w:rStyle w:val="katex-mathml"/>
+          <w:i/>
+          <w:iCs/>
+        </w:rPr>
+        <w:t>Tmax_pkt</w:t>
+      </w:r>
+      <w:r>
+        <w:rPr>
+          <w:rStyle w:val="vlist-s"/>
+          <w:i/>
+          <w:iCs/>
+        </w:rPr>
+        <w:t xml:space="preserve"> </w:t>
+      </w:r>
+      <w:r>
+        <w:rPr>
+          <w:rStyle w:val="vlist-s"/>
+          <w:i/>
+          <w:iCs/>
+        </w:rPr>
+        <w:t>​</w:t>
+      </w:r>
+      <w:r>
+        <w:rPr>
+          <w:rStyle w:val="mrel"/>
+          <w:i/>
+          <w:iCs/>
+        </w:rPr>
+        <w:t>≈</w:t>
+      </w:r>
+      <w:r>
+        <w:rPr>
+          <w:rStyle w:val="mord"/>
+          <w:i/>
+          <w:iCs/>
+        </w:rPr>
+        <w:t>720</w:t>
+      </w:r>
+      <w:r>
+        <w:rPr>
+          <w:i/>
+          <w:iCs/>
+        </w:rPr>
+        <w:t xml:space="preserve"> ns.</w:t>
       </w:r>
     </w:p>
     <w:p>
       <w:pPr>
         <w:spacing w:before="100" w:beforeAutospacing="1" w:after="100" w:afterAutospacing="1" w:line="240" w:lineRule="auto"/>
-        <w:outlineLvl w:val="2"/>
-        <w:rPr>
-          <w:rFonts w:ascii="Times New Roman" w:eastAsia="Times New Roman" w:hAnsi="Times New Roman" w:cs="Times New Roman"/>
-          <w:b/>
-          <w:bCs/>
-          <w:sz w:val="27"/>
-          <w:szCs w:val="27"/>
-        </w:rPr>
-      </w:pPr>
-      <w:r>
-        <w:rPr>
-          <w:rFonts w:ascii="Times New Roman" w:eastAsia="Times New Roman" w:hAnsi="Times New Roman" w:cs="Times New Roman"/>
-          <w:b/>
-          <w:bCs/>
-          <w:sz w:val="27"/>
-          <w:szCs w:val="27"/>
-        </w:rPr>
-        <w:t>9. Discussion and Future Work</w:t>
+      </w:pPr>
+      <w:r>
+        <w:rPr>
+          <w:rStyle w:val="Strong"/>
+        </w:rPr>
+        <w:t>Cell-Based Bound:</w:t>
+      </w:r>
+      <w:r>
+        <w:t xml:space="preserve"> In CellBox, the discrepancy is bounded by </w:t>
       </w:r>
     </w:p>
     <w:p>
       <w:pPr>
         <w:spacing w:before="100" w:beforeAutospacing="1" w:after="100" w:afterAutospacing="1" w:line="240" w:lineRule="auto"/>
-        <w:rPr>
-          <w:rFonts w:ascii="Times New Roman" w:eastAsia="Times New Roman" w:hAnsi="Times New Roman" w:cs="Times New Roman"/>
-          <w:sz w:val="24"/>
-          <w:szCs w:val="24"/>
-        </w:rPr>
-      </w:pPr>
-      <w:r>
-        <w:rPr>
-          <w:rFonts w:ascii="Times New Roman" w:eastAsia="Times New Roman" w:hAnsi="Times New Roman" w:cs="Times New Roman"/>
-          <w:sz w:val="24"/>
-          <w:szCs w:val="24"/>
-        </w:rPr>
-        <w:t xml:space="preserve">The </w:t>
-      </w:r>
-      <w:proofErr w:type="spellStart"/>
-      <w:r>
-        <w:rPr>
-          <w:rFonts w:ascii="Times New Roman" w:eastAsia="Times New Roman" w:hAnsi="Times New Roman" w:cs="Times New Roman"/>
-          <w:sz w:val="24"/>
-          <w:szCs w:val="24"/>
-        </w:rPr>
-        <w:t>CellBox</w:t>
-      </w:r>
-      <w:proofErr w:type="spellEnd"/>
-      <w:r>
-        <w:rPr>
-          <w:rFonts w:ascii="Times New Roman" w:eastAsia="Times New Roman" w:hAnsi="Times New Roman" w:cs="Times New Roman"/>
-          <w:sz w:val="24"/>
-          <w:szCs w:val="24"/>
-        </w:rPr>
-        <w:t xml:space="preserve"> architecture opens several avenues for future exploration. Adaptive control of scheduling granularity, integration with credit-based flow control mechanisms, and formal verification of fairness and delay guarantees are all promising directions. An FPGA prototype and large-scale experimental evaluation would provide valuable validation of the analytical benefits described in this paper.</w:t>
+        <w:jc w:val="center"/>
+        <w:rPr>
+          <w:rStyle w:val="katex-mathml"/>
+          <w:i/>
+          <w:iCs/>
+        </w:rPr>
+      </w:pPr>
+      <w:r>
+        <w:rPr>
+          <w:rStyle w:val="katex-mathml"/>
+          <w:i/>
+          <w:iCs/>
+        </w:rPr>
+        <w:t>(L−1)</w:t>
+      </w:r>
+      <w:r>
+        <w:rPr>
+          <w:rStyle w:val="katex-mathml"/>
+          <w:rFonts w:ascii="Cambria Math" w:hAnsi="Cambria Math" w:cs="Cambria Math"/>
+          <w:i/>
+          <w:iCs/>
+        </w:rPr>
+        <w:t>⋅</w:t>
+      </w:r>
+      <w:r>
+        <w:rPr>
+          <w:rStyle w:val="katex-mathml"/>
+          <w:i/>
+          <w:iCs/>
+        </w:rPr>
+        <w:t>Tcell</w:t>
       </w:r>
     </w:p>
     <w:p>
       <w:pPr>
-        <w:spacing w:after="0" w:line="240" w:lineRule="auto"/>
-        <w:rPr>
-          <w:rFonts w:ascii="Times New Roman" w:eastAsia="Times New Roman" w:hAnsi="Times New Roman" w:cs="Times New Roman"/>
-          <w:sz w:val="24"/>
-          <w:szCs w:val="24"/>
-        </w:rPr>
-      </w:pPr>
-      <w:r>
-        <w:rPr>
-          <w:rFonts w:ascii="Times New Roman" w:eastAsia="Times New Roman" w:hAnsi="Times New Roman" w:cs="Times New Roman"/>
-          <w:sz w:val="24"/>
-          <w:szCs w:val="24"/>
-        </w:rPr>
-        <w:pict w14:anchorId="3A3E9F40">
-          <v:rect id="_x0000_i1075" style="width:0;height:1.5pt" o:hralign="center" o:hrstd="t" o:hr="t" fillcolor="#a0a0a0" stroked="f"/>
-        </w:pict>
+        <w:spacing w:before="100" w:beforeAutospacing="1" w:after="100" w:afterAutospacing="1" w:line="240" w:lineRule="auto"/>
+      </w:pPr>
+      <w:r>
+        <w:rPr>
+          <w:rStyle w:val="vlist-s"/>
+        </w:rPr>
+        <w:t xml:space="preserve"> </w:t>
+      </w:r>
+      <w:r>
+        <w:t xml:space="preserve"> For a 64-byte cell at 100Gbps,</w:t>
       </w:r>
     </w:p>
     <w:p>
       <w:pPr>
         <w:spacing w:before="100" w:beforeAutospacing="1" w:after="100" w:afterAutospacing="1" w:line="240" w:lineRule="auto"/>
-        <w:outlineLvl w:val="2"/>
-        <w:rPr>
-          <w:rFonts w:ascii="Times New Roman" w:eastAsia="Times New Roman" w:hAnsi="Times New Roman" w:cs="Times New Roman"/>
-          <w:b/>
-          <w:bCs/>
-          <w:sz w:val="27"/>
-          <w:szCs w:val="27"/>
-        </w:rPr>
-      </w:pPr>
-      <w:r>
-        <w:rPr>
-          <w:rFonts w:ascii="Times New Roman" w:eastAsia="Times New Roman" w:hAnsi="Times New Roman" w:cs="Times New Roman"/>
-          <w:b/>
-          <w:bCs/>
-          <w:sz w:val="27"/>
-          <w:szCs w:val="27"/>
-        </w:rPr>
-        <w:t>10. Conclusion</w:t>
+        <w:jc w:val="center"/>
+        <w:rPr>
+          <w:i/>
+          <w:iCs/>
+        </w:rPr>
+      </w:pPr>
+      <w:r>
+        <w:rPr>
+          <w:rStyle w:val="katex-mathml"/>
+          <w:i/>
+          <w:iCs/>
+        </w:rPr>
+        <w:t>Tcell</w:t>
+      </w:r>
+      <w:r>
+        <w:rPr>
+          <w:rStyle w:val="vlist-s"/>
+          <w:i/>
+          <w:iCs/>
+        </w:rPr>
+        <w:t>​</w:t>
+      </w:r>
+      <w:r>
+        <w:rPr>
+          <w:rStyle w:val="mrel"/>
+          <w:i/>
+          <w:iCs/>
+        </w:rPr>
+        <w:t>≈</w:t>
+      </w:r>
+      <w:r>
+        <w:rPr>
+          <w:rStyle w:val="mord"/>
+          <w:i/>
+          <w:iCs/>
+        </w:rPr>
+        <w:t>5.12</w:t>
+      </w:r>
+      <w:r>
+        <w:rPr>
+          <w:i/>
+          <w:iCs/>
+        </w:rPr>
+        <w:t xml:space="preserve"> ns.</w:t>
       </w:r>
     </w:p>
     <w:p>
       <w:pPr>
+        <w:pStyle w:val="NormalWeb"/>
+      </w:pPr>
+      <w:r>
+        <w:t>This represents a theoretical reduction in worst-case scheduling jitter by over two orders of magnitude, independent of the traffic mix. The fixed cell size effectively decouples the delay bound from the Maximum Transmission Unit (MTU) of the network.</w:t>
+      </w:r>
+    </w:p>
+    <w:p>
+      <w:pPr>
+        <w:pStyle w:val="Heading4"/>
+      </w:pPr>
+      <w:r>
+        <w:t>4.2 Memory Efficiency</w:t>
+      </w:r>
+    </w:p>
+    <w:p>
+      <w:pPr>
+        <w:pStyle w:val="NormalWeb"/>
+      </w:pPr>
+      <w:r>
+        <w:t xml:space="preserve">Let </w:t>
+      </w:r>
+      <w:r>
+        <w:rPr>
+          <w:rStyle w:val="katex-mathml"/>
+        </w:rPr>
+        <w:t>Oi(t)</w:t>
+      </w:r>
+      <w:r>
+        <w:t xml:space="preserve"> be the occupancy of hierarchy level </w:t>
+      </w:r>
+      <w:r>
+        <w:rPr>
+          <w:rStyle w:val="katex-mathml"/>
+        </w:rPr>
+        <w:t>i</w:t>
+      </w:r>
+      <w:r>
+        <w:t xml:space="preserve"> at time </w:t>
+      </w:r>
+      <w:r>
+        <w:rPr>
+          <w:rStyle w:val="katex-mathml"/>
+        </w:rPr>
+        <w:t>t</w:t>
+      </w:r>
+      <w:r>
+        <w:t>.</w:t>
+      </w:r>
+    </w:p>
+    <w:p>
+      <w:pPr>
         <w:spacing w:before="100" w:beforeAutospacing="1" w:after="100" w:afterAutospacing="1" w:line="240" w:lineRule="auto"/>
-        <w:rPr>
-          <w:rFonts w:ascii="Times New Roman" w:eastAsia="Times New Roman" w:hAnsi="Times New Roman" w:cs="Times New Roman"/>
-          <w:sz w:val="24"/>
-          <w:szCs w:val="24"/>
-        </w:rPr>
-      </w:pPr>
-      <w:r>
-        <w:rPr>
-          <w:rFonts w:ascii="Times New Roman" w:eastAsia="Times New Roman" w:hAnsi="Times New Roman" w:cs="Times New Roman"/>
-          <w:sz w:val="24"/>
-          <w:szCs w:val="24"/>
-        </w:rPr>
-        <w:t xml:space="preserve">This paper introduced </w:t>
-      </w:r>
-      <w:proofErr w:type="spellStart"/>
-      <w:r>
-        <w:rPr>
-          <w:rFonts w:ascii="Times New Roman" w:eastAsia="Times New Roman" w:hAnsi="Times New Roman" w:cs="Times New Roman"/>
-          <w:sz w:val="24"/>
-          <w:szCs w:val="24"/>
-        </w:rPr>
-        <w:t>CellBox</w:t>
-      </w:r>
-      <w:proofErr w:type="spellEnd"/>
-      <w:r>
-        <w:rPr>
-          <w:rFonts w:ascii="Times New Roman" w:eastAsia="Times New Roman" w:hAnsi="Times New Roman" w:cs="Times New Roman"/>
-          <w:sz w:val="24"/>
-          <w:szCs w:val="24"/>
-        </w:rPr>
-        <w:t xml:space="preserve">, a cell-granular hierarchical scheduler designed for modern programmable switch fabrics. By decoupling scheduling precision from packet size and eliminating static buffer partitioning, </w:t>
-      </w:r>
-      <w:proofErr w:type="spellStart"/>
-      <w:r>
-        <w:rPr>
-          <w:rFonts w:ascii="Times New Roman" w:eastAsia="Times New Roman" w:hAnsi="Times New Roman" w:cs="Times New Roman"/>
-          <w:sz w:val="24"/>
-          <w:szCs w:val="24"/>
-        </w:rPr>
-        <w:t>CellBox</w:t>
-      </w:r>
-      <w:proofErr w:type="spellEnd"/>
-      <w:r>
-        <w:rPr>
-          <w:rFonts w:ascii="Times New Roman" w:eastAsia="Times New Roman" w:hAnsi="Times New Roman" w:cs="Times New Roman"/>
-          <w:sz w:val="24"/>
-          <w:szCs w:val="24"/>
-        </w:rPr>
-        <w:t xml:space="preserve"> addresses fundamental limitations of existing hierarchical schedulers. The proposed architecture preserves hardware efficiency while offering tighter delay bounds and significantly improved memory utilization, making it a strong candidate for next-generation programmable data planes.</w:t>
+      </w:pPr>
+      <w:r>
+        <w:rPr>
+          <w:rStyle w:val="Strong"/>
+        </w:rPr>
+        <w:lastRenderedPageBreak/>
+        <w:t>Static Requirement:</w:t>
+      </w:r>
+      <w:r>
+        <w:t xml:space="preserve"> A statically partitioned system requires </w:t>
+      </w:r>
+      <w:r>
+        <w:rPr>
+          <w:rStyle w:val="katex-mathml"/>
+        </w:rPr>
+        <w:t>Mstatic=∑i=0L−1max</w:t>
+      </w:r>
+      <w:r>
+        <w:rPr>
+          <w:rStyle w:val="katex-mathml"/>
+        </w:rPr>
+        <w:t xml:space="preserve"> </w:t>
+      </w:r>
+      <w:r>
+        <w:rPr>
+          <w:rStyle w:val="katex-mathml"/>
+        </w:rPr>
+        <w:t>(Oi(t))M_{static} = \sum_{i=0}^{L-1} \max(O_i(t))</w:t>
+      </w:r>
+      <w:r>
+        <w:rPr>
+          <w:rStyle w:val="mord"/>
+        </w:rPr>
+        <w:t>Mstatic</w:t>
+      </w:r>
+      <w:r>
+        <w:rPr>
+          <w:rStyle w:val="vlist-s"/>
+        </w:rPr>
+        <w:t>​</w:t>
+      </w:r>
+      <w:r>
+        <w:rPr>
+          <w:rStyle w:val="mrel"/>
+        </w:rPr>
+        <w:t>=</w:t>
+      </w:r>
+      <w:r>
+        <w:rPr>
+          <w:rStyle w:val="mop"/>
+        </w:rPr>
+        <w:t>∑</w:t>
+      </w:r>
+      <w:r>
+        <w:rPr>
+          <w:rStyle w:val="mord"/>
+        </w:rPr>
+        <w:t>i</w:t>
+      </w:r>
+      <w:r>
+        <w:rPr>
+          <w:rStyle w:val="mrel"/>
+        </w:rPr>
+        <w:t>=</w:t>
+      </w:r>
+      <w:r>
+        <w:rPr>
+          <w:rStyle w:val="mord"/>
+        </w:rPr>
+        <w:t>0L</w:t>
+      </w:r>
+      <w:r>
+        <w:rPr>
+          <w:rStyle w:val="mbin"/>
+        </w:rPr>
+        <w:t>−</w:t>
+      </w:r>
+      <w:r>
+        <w:rPr>
+          <w:rStyle w:val="mord"/>
+        </w:rPr>
+        <w:t>1</w:t>
+      </w:r>
+      <w:r>
+        <w:rPr>
+          <w:rStyle w:val="vlist-s"/>
+        </w:rPr>
+        <w:t>​</w:t>
+      </w:r>
+      <w:r>
+        <w:rPr>
+          <w:rStyle w:val="mop"/>
+        </w:rPr>
+        <w:t>max</w:t>
+      </w:r>
+      <w:r>
+        <w:rPr>
+          <w:rStyle w:val="mopen"/>
+        </w:rPr>
+        <w:t>(</w:t>
+      </w:r>
+      <w:r>
+        <w:rPr>
+          <w:rStyle w:val="mord"/>
+        </w:rPr>
+        <w:t>Oi</w:t>
+      </w:r>
+      <w:r>
+        <w:rPr>
+          <w:rStyle w:val="vlist-s"/>
+        </w:rPr>
+        <w:t>​</w:t>
+      </w:r>
+      <w:r>
+        <w:rPr>
+          <w:rStyle w:val="mopen"/>
+        </w:rPr>
+        <w:t>(</w:t>
+      </w:r>
+      <w:r>
+        <w:rPr>
+          <w:rStyle w:val="mord"/>
+        </w:rPr>
+        <w:t>t</w:t>
+      </w:r>
+      <w:r>
+        <w:rPr>
+          <w:rStyle w:val="mclose"/>
+        </w:rPr>
+        <w:t>))</w:t>
+      </w:r>
+      <w:r>
+        <w:t>.</w:t>
+      </w:r>
+    </w:p>
+    <w:p>
+      <w:pPr>
+        <w:numPr>
+          <w:ilvl w:val="0"/>
+          <w:numId w:val="38"/>
+        </w:numPr>
+        <w:spacing w:before="100" w:beforeAutospacing="1" w:after="100" w:afterAutospacing="1" w:line="240" w:lineRule="auto"/>
+      </w:pPr>
+      <w:r>
+        <w:rPr>
+          <w:rStyle w:val="Strong"/>
+        </w:rPr>
+        <w:t>Dynamic Requirement:</w:t>
+      </w:r>
+      <w:r>
+        <w:t xml:space="preserve"> CellBox requires </w:t>
+      </w:r>
+      <w:r>
+        <w:rPr>
+          <w:rStyle w:val="katex-mathml"/>
+        </w:rPr>
+        <w:t>Mdynamic=max</w:t>
+      </w:r>
+      <w:r>
+        <w:rPr>
+          <w:rStyle w:val="katex-mathml"/>
+          <w:rFonts w:ascii="Cambria Math" w:hAnsi="Cambria Math" w:cs="Cambria Math"/>
+        </w:rPr>
+        <w:t>⁡</w:t>
+      </w:r>
+      <w:r>
+        <w:rPr>
+          <w:rStyle w:val="katex-mathml"/>
+        </w:rPr>
+        <w:t>(∑i=0L−1Oi(t))M_{dynamic} = \max(\sum_{i=0}^{L-1} O_i(t))</w:t>
+      </w:r>
+      <w:r>
+        <w:rPr>
+          <w:rStyle w:val="mord"/>
+        </w:rPr>
+        <w:t>Mdynamic</w:t>
+      </w:r>
+      <w:r>
+        <w:rPr>
+          <w:rStyle w:val="vlist-s"/>
+        </w:rPr>
+        <w:t>​</w:t>
+      </w:r>
+      <w:r>
+        <w:rPr>
+          <w:rStyle w:val="mrel"/>
+        </w:rPr>
+        <w:t>=</w:t>
+      </w:r>
+      <w:r>
+        <w:rPr>
+          <w:rStyle w:val="mop"/>
+        </w:rPr>
+        <w:t>max</w:t>
+      </w:r>
+      <w:r>
+        <w:rPr>
+          <w:rStyle w:val="mopen"/>
+        </w:rPr>
+        <w:t>(</w:t>
+      </w:r>
+      <w:r>
+        <w:rPr>
+          <w:rStyle w:val="mop"/>
+        </w:rPr>
+        <w:t>∑</w:t>
+      </w:r>
+      <w:r>
+        <w:rPr>
+          <w:rStyle w:val="mord"/>
+        </w:rPr>
+        <w:t>i</w:t>
+      </w:r>
+      <w:r>
+        <w:rPr>
+          <w:rStyle w:val="mrel"/>
+        </w:rPr>
+        <w:t>=</w:t>
+      </w:r>
+      <w:r>
+        <w:rPr>
+          <w:rStyle w:val="mord"/>
+        </w:rPr>
+        <w:t>0L</w:t>
+      </w:r>
+      <w:r>
+        <w:rPr>
+          <w:rStyle w:val="mbin"/>
+        </w:rPr>
+        <w:t>−</w:t>
+      </w:r>
+      <w:r>
+        <w:rPr>
+          <w:rStyle w:val="mord"/>
+        </w:rPr>
+        <w:t>1</w:t>
+      </w:r>
+      <w:r>
+        <w:rPr>
+          <w:rStyle w:val="vlist-s"/>
+        </w:rPr>
+        <w:t>​</w:t>
+      </w:r>
+      <w:r>
+        <w:rPr>
+          <w:rStyle w:val="mord"/>
+        </w:rPr>
+        <w:t>Oi</w:t>
+      </w:r>
+      <w:r>
+        <w:rPr>
+          <w:rStyle w:val="vlist-s"/>
+        </w:rPr>
+        <w:t>​</w:t>
+      </w:r>
+      <w:r>
+        <w:rPr>
+          <w:rStyle w:val="mopen"/>
+        </w:rPr>
+        <w:t>(</w:t>
+      </w:r>
+      <w:r>
+        <w:rPr>
+          <w:rStyle w:val="mord"/>
+        </w:rPr>
+        <w:t>t</w:t>
+      </w:r>
+      <w:r>
+        <w:rPr>
+          <w:rStyle w:val="mclose"/>
+        </w:rPr>
+        <w:t>))</w:t>
+      </w:r>
+      <w:r>
+        <w:t>.</w:t>
+      </w:r>
+    </w:p>
+    <w:p>
+      <w:pPr>
+        <w:pStyle w:val="NormalWeb"/>
+      </w:pPr>
+      <w:r>
+        <w:t xml:space="preserve">Since traffic bursts are rarely correlated across all timescales simultaneously, </w:t>
+      </w:r>
+      <w:r>
+        <w:rPr>
+          <w:rStyle w:val="katex-mathml"/>
+        </w:rPr>
+        <w:t>max⁡(∑Oi)</w:t>
+      </w:r>
+      <w:r>
+        <w:rPr>
+          <w:rStyle w:val="katex-mathml"/>
+          <w:rFonts w:ascii="Cambria Math" w:hAnsi="Cambria Math" w:cs="Cambria Math"/>
+        </w:rPr>
+        <w:t>≪</w:t>
+      </w:r>
+      <w:r>
+        <w:rPr>
+          <w:rStyle w:val="katex-mathml"/>
+        </w:rPr>
+        <w:t>∑max⁡(Oi)\max(\sum O_i) \ll \sum \max(O_i)</w:t>
+      </w:r>
+      <w:r>
+        <w:rPr>
+          <w:rStyle w:val="mop"/>
+        </w:rPr>
+        <w:t>max</w:t>
+      </w:r>
+      <w:r>
+        <w:rPr>
+          <w:rStyle w:val="mopen"/>
+        </w:rPr>
+        <w:t>(</w:t>
+      </w:r>
+      <w:r>
+        <w:rPr>
+          <w:rStyle w:val="mop"/>
+        </w:rPr>
+        <w:t>∑</w:t>
+      </w:r>
+      <w:r>
+        <w:rPr>
+          <w:rStyle w:val="mord"/>
+        </w:rPr>
+        <w:t>Oi</w:t>
+      </w:r>
+      <w:r>
+        <w:rPr>
+          <w:rStyle w:val="vlist-s"/>
+        </w:rPr>
+        <w:t>​</w:t>
+      </w:r>
+      <w:r>
+        <w:rPr>
+          <w:rStyle w:val="mclose"/>
+        </w:rPr>
+        <w:t>)</w:t>
+      </w:r>
+      <w:r>
+        <w:rPr>
+          <w:rStyle w:val="mrel"/>
+          <w:rFonts w:ascii="Cambria Math" w:hAnsi="Cambria Math" w:cs="Cambria Math"/>
+        </w:rPr>
+        <w:t>≪</w:t>
+      </w:r>
+      <w:r>
+        <w:rPr>
+          <w:rStyle w:val="mop"/>
+        </w:rPr>
+        <w:t>∑max</w:t>
+      </w:r>
+      <w:r>
+        <w:rPr>
+          <w:rStyle w:val="mopen"/>
+        </w:rPr>
+        <w:t>(</w:t>
+      </w:r>
+      <w:r>
+        <w:rPr>
+          <w:rStyle w:val="mord"/>
+        </w:rPr>
+        <w:t>Oi</w:t>
+      </w:r>
+      <w:r>
+        <w:rPr>
+          <w:rStyle w:val="vlist-s"/>
+        </w:rPr>
+        <w:t>​</w:t>
+      </w:r>
+      <w:r>
+        <w:rPr>
+          <w:rStyle w:val="mclose"/>
+        </w:rPr>
+        <w:t>)</w:t>
+      </w:r>
+      <w:r>
+        <w:t>. Analytically, this suggests that CellBox can support higher aggregate burst absorption for the same total memory footprint, or conversely, achieve the same performance with significantly less on-chip memory.</w:t>
+      </w:r>
+    </w:p>
+    <w:p>
+      <w:r>
+        <w:pict w14:anchorId="27FC087A">
+          <v:rect id="_x0000_i1030" style="width:0;height:1.5pt" o:hralign="center" o:hrstd="t" o:hr="t" fillcolor="#a0a0a0" stroked="f"/>
+        </w:pict>
+      </w:r>
+    </w:p>
+    <w:p>
+      <w:pPr>
+        <w:pStyle w:val="Heading3"/>
+      </w:pPr>
+      <w:r>
+        <w:t>5. Implementation Considerations</w:t>
+      </w:r>
+    </w:p>
+    <w:p>
+      <w:pPr>
+        <w:pStyle w:val="NormalWeb"/>
+      </w:pPr>
+      <w:r>
+        <w:t>The CellBox architecture is designed for feasibility on modern FPGA and ASIC targets.</w:t>
+      </w:r>
+    </w:p>
+    <w:p>
+      <w:pPr>
+        <w:pStyle w:val="Heading4"/>
+      </w:pPr>
+      <w:r>
+        <w:t>5.1 Hardware Complexity</w:t>
+      </w:r>
+    </w:p>
+    <w:p>
+      <w:pPr>
+        <w:pStyle w:val="NormalWeb"/>
+      </w:pPr>
+      <w:r>
+        <w:t>While cell segmentation adds logic overhead, the scheduler itself is simplified. Packet-based schedulers require complex logic to handle "leftover" credits when a packet is smaller than the service quantum, or "deficit" tracking when it is larger. CellBox eliminates this complexity; every scheduling operation consumes exactly one unit of credit.</w:t>
+      </w:r>
+    </w:p>
+    <w:p>
+      <w:pPr>
+        <w:pStyle w:val="Heading4"/>
+      </w:pPr>
+      <w:r>
+        <w:t>5.2 Integration with Programmable Fabrics</w:t>
+      </w:r>
+    </w:p>
+    <w:p>
+      <w:pPr>
+        <w:pStyle w:val="NormalWeb"/>
+      </w:pPr>
+      <w:r>
+        <w:t xml:space="preserve">CellBox exposes a runtime configuration interface (e.g., AXI-Lite) allowing control plane software to adjust hierarchy weights and granularity </w:t>
+      </w:r>
+      <w:r>
+        <w:rPr>
+          <w:rStyle w:val="katex-mathml"/>
+        </w:rPr>
+        <w:t>g</w:t>
+      </w:r>
+      <w:r>
+        <w:t xml:space="preserve"> dynamically. This allows the scheduler to adapt to changing workload requirements without hardware reconfiguration. The design interfaces with standard Virtual Output Queues (VOQs), utilizing the calculated departure time to map packets to the appropriate logical hierarchy level.</w:t>
+      </w:r>
+    </w:p>
+    <w:p>
+      <w:pPr>
+        <w:pStyle w:val="Heading4"/>
+      </w:pPr>
+      <w:r>
+        <w:t>5.3 Reassembly</w:t>
+      </w:r>
+    </w:p>
+    <w:p>
+      <w:pPr>
+        <w:pStyle w:val="NormalWeb"/>
+      </w:pPr>
+      <w:r>
+        <w:t>A Reassembly Engine sits at the egress of the scheduler. It ensures that cells belonging to the same packet are reconstructed into a continuous stream before being handed off to the MAC layer. To minimize latency, reassembly can operate in a "cut-through" mode where the packet header is transmitted as soon as the first cell is scheduled, provided the fabric guarantees the subsequent cells will arrive within the transmission window.</w:t>
+      </w:r>
+    </w:p>
+    <w:p>
+      <w:r>
+        <w:pict w14:anchorId="0ADDF88E">
+          <v:rect id="_x0000_i1031" style="width:0;height:1.5pt" o:hralign="center" o:hrstd="t" o:hr="t" fillcolor="#a0a0a0" stroked="f"/>
+        </w:pict>
+      </w:r>
+    </w:p>
+    <w:p>
+      <w:pPr>
+        <w:pStyle w:val="Heading3"/>
+      </w:pPr>
+      <w:r>
+        <w:t>6. Proposed Evaluation Methodology</w:t>
+      </w:r>
+    </w:p>
+    <w:p>
+      <w:pPr>
+        <w:pStyle w:val="NormalWeb"/>
+      </w:pPr>
+      <w:r>
+        <w:lastRenderedPageBreak/>
+        <w:t>To validate the CellBox architecture, we propose a comprehensive evaluation strategy comparing it against three baselines: the original packet-based Gearbox, a standard Deficit Round Robin (DRR) scheduler, and the programmable vPIFO scheduler.</w:t>
+      </w:r>
+    </w:p>
+    <w:p>
+      <w:pPr>
+        <w:pStyle w:val="NormalWeb"/>
+      </w:pPr>
+      <w:r>
+        <w:rPr>
+          <w:rStyle w:val="Strong"/>
+        </w:rPr>
+        <w:t>Simulation Framework:</w:t>
+      </w:r>
+      <w:r>
+        <w:br/>
+        <w:t>We plan to utilize a cycle-accurate SystemVerilog testbench to measure hardware-level metrics, coupled with discrete event simulation (e.g., NS-3) for network-level performance.</w:t>
+      </w:r>
+    </w:p>
+    <w:p>
+      <w:pPr>
+        <w:pStyle w:val="NormalWeb"/>
+      </w:pPr>
+      <w:r>
+        <w:rPr>
+          <w:rStyle w:val="Strong"/>
+        </w:rPr>
+        <w:t>Key Metrics:</w:t>
+      </w:r>
+    </w:p>
+    <w:p>
+      <w:pPr>
+        <w:numPr>
+          <w:ilvl w:val="0"/>
+          <w:numId w:val="39"/>
+        </w:numPr>
+        <w:spacing w:before="100" w:beforeAutospacing="1" w:after="100" w:afterAutospacing="1" w:line="240" w:lineRule="auto"/>
+      </w:pPr>
+      <w:r>
+        <w:rPr>
+          <w:rStyle w:val="Strong"/>
+        </w:rPr>
+        <w:t>Departure Time Discrepancy (DTD):</w:t>
+      </w:r>
+      <w:r>
+        <w:t xml:space="preserve"> We will measure the CDF of the difference between ideal and actual departure times under mixed workloads (e.g., 50% small control packets, 50% jumbo frames). We expect CellBox to show a significantly tighter distribution tail.</w:t>
+      </w:r>
+    </w:p>
+    <w:p>
+      <w:pPr>
+        <w:numPr>
+          <w:ilvl w:val="0"/>
+          <w:numId w:val="39"/>
+        </w:numPr>
+        <w:spacing w:before="100" w:beforeAutospacing="1" w:after="100" w:afterAutospacing="1" w:line="240" w:lineRule="auto"/>
+      </w:pPr>
+      <w:r>
+        <w:rPr>
+          <w:rStyle w:val="Strong"/>
+        </w:rPr>
+        <w:t>Memory Utilization:</w:t>
+      </w:r>
+      <w:r>
+        <w:t xml:space="preserve"> We will simulate bursty traffic patterns where active flows shift rapidly between hierarchy levels. We aim to quantify the reduction in total memory required to achieve zero packet drops compared to static partitioning.</w:t>
+      </w:r>
+    </w:p>
+    <w:p>
+      <w:pPr>
+        <w:numPr>
+          <w:ilvl w:val="0"/>
+          <w:numId w:val="39"/>
+        </w:numPr>
+        <w:spacing w:before="100" w:beforeAutospacing="1" w:after="100" w:afterAutospacing="1" w:line="240" w:lineRule="auto"/>
+      </w:pPr>
+      <w:r>
+        <w:rPr>
+          <w:rStyle w:val="Strong"/>
+        </w:rPr>
+        <w:t>Resource Usage:</w:t>
+      </w:r>
+      <w:r>
+        <w:t xml:space="preserve"> We will synthesize the design on a target FPGA (e.g., Xilinx </w:t>
+      </w:r>
+      <w:r>
+        <w:t>Kintex Ultrascale+</w:t>
+      </w:r>
+      <w:r>
+        <w:t>) to quantify the Look-Up Table (LUT) and Block RAM (BRAM) overhead of the cell management logic versus the savings in buffer memory.</w:t>
+      </w:r>
+    </w:p>
+    <w:p>
+      <w:pPr>
+        <w:spacing w:after="0"/>
+      </w:pPr>
+      <w:r>
+        <w:pict w14:anchorId="009516F6">
+          <v:rect id="_x0000_i1032" style="width:0;height:1.5pt" o:hralign="center" o:hrstd="t" o:hr="t" fillcolor="#a0a0a0" stroked="f"/>
+        </w:pict>
+      </w:r>
+    </w:p>
+    <w:p>
+      <w:pPr>
+        <w:pStyle w:val="Heading3"/>
+      </w:pPr>
+      <w:r>
+        <w:t>7. Related Work</w:t>
+      </w:r>
+    </w:p>
+    <w:p>
+      <w:pPr>
+        <w:pStyle w:val="NormalWeb"/>
+      </w:pPr>
+      <w:r>
+        <w:t xml:space="preserve">CellBox builds upon a rich history of scheduling research. </w:t>
+      </w:r>
+      <w:r>
+        <w:rPr>
+          <w:rStyle w:val="Strong"/>
+        </w:rPr>
+        <w:t>Gearbox</w:t>
+      </w:r>
+      <w:r>
+        <w:t xml:space="preserve"> and </w:t>
+      </w:r>
+      <w:r>
+        <w:rPr>
+          <w:rStyle w:val="Strong"/>
+        </w:rPr>
+        <w:t>vPIFO</w:t>
+      </w:r>
+      <w:r>
+        <w:t xml:space="preserve"> represent the state-of-the-art in hierarchical and programmable scheduling, respectively. While vPIFO offers extreme flexibility through virtualization, it creates implementation challenges regarding sorting complexity. Gearbox simplifies this with calendar queues but retains packet-level granularity issues.</w:t>
+      </w:r>
+    </w:p>
+    <w:p>
+      <w:pPr>
+        <w:pStyle w:val="NormalWeb"/>
+      </w:pPr>
+      <w:r>
+        <w:t xml:space="preserve">Shared memory architectures have been explored in the context of </w:t>
+      </w:r>
+      <w:r>
+        <w:rPr>
+          <w:rStyle w:val="Strong"/>
+        </w:rPr>
+        <w:t>Buffered Crossbar Switches</w:t>
+      </w:r>
+      <w:r>
+        <w:t xml:space="preserve"> and </w:t>
+      </w:r>
+      <w:r>
+        <w:rPr>
+          <w:rStyle w:val="Strong"/>
+        </w:rPr>
+        <w:t>Shared-Memory Output Queued</w:t>
+      </w:r>
+      <w:r>
+        <w:t xml:space="preserve"> switches. CellBox is novel in its application of these memory management techniques specifically to the internal structure of a hierarchical WFQ scheduler. By combining the timing logic of Gearbox with the memory architecture of shared-buffer switches, CellBox bridges the gap between theoretical fairness and hardware efficiency.</w:t>
+      </w:r>
+    </w:p>
+    <w:p>
+      <w:r>
+        <w:pict w14:anchorId="729E97C2">
+          <v:rect id="_x0000_i1033" style="width:0;height:1.5pt" o:hralign="center" o:hrstd="t" o:hr="t" fillcolor="#a0a0a0" stroked="f"/>
+        </w:pict>
+      </w:r>
+    </w:p>
+    <w:p>
+      <w:pPr>
+        <w:pStyle w:val="Heading3"/>
+      </w:pPr>
+      <w:r>
+        <w:t>8. Conclusion</w:t>
+      </w:r>
+    </w:p>
+    <w:p>
+      <w:pPr>
+        <w:pStyle w:val="NormalWeb"/>
+      </w:pPr>
+      <w:r>
+        <w:t xml:space="preserve">This paper introduced CellBox, a hierarchical scheduler that addresses the granularity and memory limitations of existing hardware approximations of Weighted Fair Queuing. By operating on fixed-size cells within a unified dynamic memory pool, CellBox theoretically achieves tighter delay bounds and superior memory utilization compared to packet-based equivalents. The architecture is designed to be practical, scalable, and adaptable, offering a </w:t>
+      </w:r>
+      <w:r>
+        <w:lastRenderedPageBreak/>
+        <w:t>promising direction for high-performance programmable network fabrics. Future work will focus on the full hardware realization and empirical validation of these analytical claims.</w:t>
       </w:r>
     </w:p>
     <w:p/>
@@ -2799,6 +3146,155 @@
     </w:lvl>
   </w:abstractNum>
   <w:abstractNum w:abstractNumId="9" w15:restartNumberingAfterBreak="0">
+    <w:nsid w:val="2AC86827"/>
+    <w:multiLevelType w:val="multilevel"/>
+    <w:tmpl w:val="BDF8843A"/>
+    <w:lvl w:ilvl="0">
+      <w:start w:val="1"/>
+      <w:numFmt w:val="bullet"/>
+      <w:lvlText w:val=""/>
+      <w:lvlJc w:val="left"/>
+      <w:pPr>
+        <w:tabs>
+          <w:tab w:val="num" w:pos="720"/>
+        </w:tabs>
+        <w:ind w:left="720" w:hanging="360"/>
+      </w:pPr>
+      <w:rPr>
+        <w:rFonts w:ascii="Symbol" w:hAnsi="Symbol" w:hint="default"/>
+        <w:sz w:val="20"/>
+      </w:rPr>
+    </w:lvl>
+    <w:lvl w:ilvl="1" w:tentative="1">
+      <w:start w:val="1"/>
+      <w:numFmt w:val="bullet"/>
+      <w:lvlText w:val="o"/>
+      <w:lvlJc w:val="left"/>
+      <w:pPr>
+        <w:tabs>
+          <w:tab w:val="num" w:pos="1440"/>
+        </w:tabs>
+        <w:ind w:left="1440" w:hanging="360"/>
+      </w:pPr>
+      <w:rPr>
+        <w:rFonts w:ascii="Courier New" w:hAnsi="Courier New" w:hint="default"/>
+        <w:sz w:val="20"/>
+      </w:rPr>
+    </w:lvl>
+    <w:lvl w:ilvl="2" w:tentative="1">
+      <w:start w:val="1"/>
+      <w:numFmt w:val="bullet"/>
+      <w:lvlText w:val=""/>
+      <w:lvlJc w:val="left"/>
+      <w:pPr>
+        <w:tabs>
+          <w:tab w:val="num" w:pos="2160"/>
+        </w:tabs>
+        <w:ind w:left="2160" w:hanging="360"/>
+      </w:pPr>
+      <w:rPr>
+        <w:rFonts w:ascii="Wingdings" w:hAnsi="Wingdings" w:hint="default"/>
+        <w:sz w:val="20"/>
+      </w:rPr>
+    </w:lvl>
+    <w:lvl w:ilvl="3" w:tentative="1">
+      <w:start w:val="1"/>
+      <w:numFmt w:val="bullet"/>
+      <w:lvlText w:val=""/>
+      <w:lvlJc w:val="left"/>
+      <w:pPr>
+        <w:tabs>
+          <w:tab w:val="num" w:pos="2880"/>
+        </w:tabs>
+        <w:ind w:left="2880" w:hanging="360"/>
+      </w:pPr>
+      <w:rPr>
+        <w:rFonts w:ascii="Wingdings" w:hAnsi="Wingdings" w:hint="default"/>
+        <w:sz w:val="20"/>
+      </w:rPr>
+    </w:lvl>
+    <w:lvl w:ilvl="4" w:tentative="1">
+      <w:start w:val="1"/>
+      <w:numFmt w:val="bullet"/>
+      <w:lvlText w:val=""/>
+      <w:lvlJc w:val="left"/>
+      <w:pPr>
+        <w:tabs>
+          <w:tab w:val="num" w:pos="3600"/>
+        </w:tabs>
+        <w:ind w:left="3600" w:hanging="360"/>
+      </w:pPr>
+      <w:rPr>
+        <w:rFonts w:ascii="Wingdings" w:hAnsi="Wingdings" w:hint="default"/>
+        <w:sz w:val="20"/>
+      </w:rPr>
+    </w:lvl>
+    <w:lvl w:ilvl="5" w:tentative="1">
+      <w:start w:val="1"/>
+      <w:numFmt w:val="bullet"/>
+      <w:lvlText w:val=""/>
+      <w:lvlJc w:val="left"/>
+      <w:pPr>
+        <w:tabs>
+          <w:tab w:val="num" w:pos="4320"/>
+        </w:tabs>
+        <w:ind w:left="4320" w:hanging="360"/>
+      </w:pPr>
+      <w:rPr>
+        <w:rFonts w:ascii="Wingdings" w:hAnsi="Wingdings" w:hint="default"/>
+        <w:sz w:val="20"/>
+      </w:rPr>
+    </w:lvl>
+    <w:lvl w:ilvl="6" w:tentative="1">
+      <w:start w:val="1"/>
+      <w:numFmt w:val="bullet"/>
+      <w:lvlText w:val=""/>
+      <w:lvlJc w:val="left"/>
+      <w:pPr>
+        <w:tabs>
+          <w:tab w:val="num" w:pos="5040"/>
+        </w:tabs>
+        <w:ind w:left="5040" w:hanging="360"/>
+      </w:pPr>
+      <w:rPr>
+        <w:rFonts w:ascii="Wingdings" w:hAnsi="Wingdings" w:hint="default"/>
+        <w:sz w:val="20"/>
+      </w:rPr>
+    </w:lvl>
+    <w:lvl w:ilvl="7" w:tentative="1">
+      <w:start w:val="1"/>
+      <w:numFmt w:val="bullet"/>
+      <w:lvlText w:val=""/>
+      <w:lvlJc w:val="left"/>
+      <w:pPr>
+        <w:tabs>
+          <w:tab w:val="num" w:pos="5760"/>
+        </w:tabs>
+        <w:ind w:left="5760" w:hanging="360"/>
+      </w:pPr>
+      <w:rPr>
+        <w:rFonts w:ascii="Wingdings" w:hAnsi="Wingdings" w:hint="default"/>
+        <w:sz w:val="20"/>
+      </w:rPr>
+    </w:lvl>
+    <w:lvl w:ilvl="8" w:tentative="1">
+      <w:start w:val="1"/>
+      <w:numFmt w:val="bullet"/>
+      <w:lvlText w:val=""/>
+      <w:lvlJc w:val="left"/>
+      <w:pPr>
+        <w:tabs>
+          <w:tab w:val="num" w:pos="6480"/>
+        </w:tabs>
+        <w:ind w:left="6480" w:hanging="360"/>
+      </w:pPr>
+      <w:rPr>
+        <w:rFonts w:ascii="Wingdings" w:hAnsi="Wingdings" w:hint="default"/>
+        <w:sz w:val="20"/>
+      </w:rPr>
+    </w:lvl>
+  </w:abstractNum>
+  <w:abstractNum w:abstractNumId="10" w15:restartNumberingAfterBreak="0">
     <w:nsid w:val="2BA167A4"/>
     <w:multiLevelType w:val="multilevel"/>
     <w:tmpl w:val="8E90A8F4"/>
@@ -2947,7 +3443,7 @@
       </w:rPr>
     </w:lvl>
   </w:abstractNum>
-  <w:abstractNum w:abstractNumId="10" w15:restartNumberingAfterBreak="0">
+  <w:abstractNum w:abstractNumId="11" w15:restartNumberingAfterBreak="0">
     <w:nsid w:val="30D170C4"/>
     <w:multiLevelType w:val="multilevel"/>
     <w:tmpl w:val="C2B4F590"/>
@@ -3060,7 +3556,7 @@
       </w:pPr>
     </w:lvl>
   </w:abstractNum>
-  <w:abstractNum w:abstractNumId="11" w15:restartNumberingAfterBreak="0">
+  <w:abstractNum w:abstractNumId="12" w15:restartNumberingAfterBreak="0">
     <w:nsid w:val="33200368"/>
     <w:multiLevelType w:val="multilevel"/>
     <w:tmpl w:val="C63435E0"/>
@@ -3173,7 +3669,7 @@
       </w:pPr>
     </w:lvl>
   </w:abstractNum>
-  <w:abstractNum w:abstractNumId="12" w15:restartNumberingAfterBreak="0">
+  <w:abstractNum w:abstractNumId="13" w15:restartNumberingAfterBreak="0">
     <w:nsid w:val="371B366B"/>
     <w:multiLevelType w:val="multilevel"/>
     <w:tmpl w:val="DCA684F4"/>
@@ -3286,7 +3782,7 @@
       </w:pPr>
     </w:lvl>
   </w:abstractNum>
-  <w:abstractNum w:abstractNumId="13" w15:restartNumberingAfterBreak="0">
+  <w:abstractNum w:abstractNumId="14" w15:restartNumberingAfterBreak="0">
     <w:nsid w:val="3B097F5A"/>
     <w:multiLevelType w:val="multilevel"/>
     <w:tmpl w:val="C6181784"/>
@@ -3435,7 +3931,7 @@
       </w:rPr>
     </w:lvl>
   </w:abstractNum>
-  <w:abstractNum w:abstractNumId="14" w15:restartNumberingAfterBreak="0">
+  <w:abstractNum w:abstractNumId="15" w15:restartNumberingAfterBreak="0">
     <w:nsid w:val="3E976E04"/>
     <w:multiLevelType w:val="multilevel"/>
     <w:tmpl w:val="C3345A02"/>
@@ -3584,7 +4080,7 @@
       </w:rPr>
     </w:lvl>
   </w:abstractNum>
-  <w:abstractNum w:abstractNumId="15" w15:restartNumberingAfterBreak="0">
+  <w:abstractNum w:abstractNumId="16" w15:restartNumberingAfterBreak="0">
     <w:nsid w:val="40605328"/>
     <w:multiLevelType w:val="multilevel"/>
     <w:tmpl w:val="FEAE15EE"/>
@@ -3733,7 +4229,120 @@
       </w:rPr>
     </w:lvl>
   </w:abstractNum>
-  <w:abstractNum w:abstractNumId="16" w15:restartNumberingAfterBreak="0">
+  <w:abstractNum w:abstractNumId="17" w15:restartNumberingAfterBreak="0">
+    <w:nsid w:val="42FC06B5"/>
+    <w:multiLevelType w:val="multilevel"/>
+    <w:tmpl w:val="177EB74E"/>
+    <w:lvl w:ilvl="0">
+      <w:start w:val="1"/>
+      <w:numFmt w:val="decimal"/>
+      <w:lvlText w:val="%1."/>
+      <w:lvlJc w:val="left"/>
+      <w:pPr>
+        <w:tabs>
+          <w:tab w:val="num" w:pos="720"/>
+        </w:tabs>
+        <w:ind w:left="720" w:hanging="360"/>
+      </w:pPr>
+    </w:lvl>
+    <w:lvl w:ilvl="1" w:tentative="1">
+      <w:start w:val="1"/>
+      <w:numFmt w:val="decimal"/>
+      <w:lvlText w:val="%2."/>
+      <w:lvlJc w:val="left"/>
+      <w:pPr>
+        <w:tabs>
+          <w:tab w:val="num" w:pos="1440"/>
+        </w:tabs>
+        <w:ind w:left="1440" w:hanging="360"/>
+      </w:pPr>
+    </w:lvl>
+    <w:lvl w:ilvl="2" w:tentative="1">
+      <w:start w:val="1"/>
+      <w:numFmt w:val="decimal"/>
+      <w:lvlText w:val="%3."/>
+      <w:lvlJc w:val="left"/>
+      <w:pPr>
+        <w:tabs>
+          <w:tab w:val="num" w:pos="2160"/>
+        </w:tabs>
+        <w:ind w:left="2160" w:hanging="360"/>
+      </w:pPr>
+    </w:lvl>
+    <w:lvl w:ilvl="3" w:tentative="1">
+      <w:start w:val="1"/>
+      <w:numFmt w:val="decimal"/>
+      <w:lvlText w:val="%4."/>
+      <w:lvlJc w:val="left"/>
+      <w:pPr>
+        <w:tabs>
+          <w:tab w:val="num" w:pos="2880"/>
+        </w:tabs>
+        <w:ind w:left="2880" w:hanging="360"/>
+      </w:pPr>
+    </w:lvl>
+    <w:lvl w:ilvl="4" w:tentative="1">
+      <w:start w:val="1"/>
+      <w:numFmt w:val="decimal"/>
+      <w:lvlText w:val="%5."/>
+      <w:lvlJc w:val="left"/>
+      <w:pPr>
+        <w:tabs>
+          <w:tab w:val="num" w:pos="3600"/>
+        </w:tabs>
+        <w:ind w:left="3600" w:hanging="360"/>
+      </w:pPr>
+    </w:lvl>
+    <w:lvl w:ilvl="5" w:tentative="1">
+      <w:start w:val="1"/>
+      <w:numFmt w:val="decimal"/>
+      <w:lvlText w:val="%6."/>
+      <w:lvlJc w:val="left"/>
+      <w:pPr>
+        <w:tabs>
+          <w:tab w:val="num" w:pos="4320"/>
+        </w:tabs>
+        <w:ind w:left="4320" w:hanging="360"/>
+      </w:pPr>
+    </w:lvl>
+    <w:lvl w:ilvl="6" w:tentative="1">
+      <w:start w:val="1"/>
+      <w:numFmt w:val="decimal"/>
+      <w:lvlText w:val="%7."/>
+      <w:lvlJc w:val="left"/>
+      <w:pPr>
+        <w:tabs>
+          <w:tab w:val="num" w:pos="5040"/>
+        </w:tabs>
+        <w:ind w:left="5040" w:hanging="360"/>
+      </w:pPr>
+    </w:lvl>
+    <w:lvl w:ilvl="7" w:tentative="1">
+      <w:start w:val="1"/>
+      <w:numFmt w:val="decimal"/>
+      <w:lvlText w:val="%8."/>
+      <w:lvlJc w:val="left"/>
+      <w:pPr>
+        <w:tabs>
+          <w:tab w:val="num" w:pos="5760"/>
+        </w:tabs>
+        <w:ind w:left="5760" w:hanging="360"/>
+      </w:pPr>
+    </w:lvl>
+    <w:lvl w:ilvl="8" w:tentative="1">
+      <w:start w:val="1"/>
+      <w:numFmt w:val="decimal"/>
+      <w:lvlText w:val="%9."/>
+      <w:lvlJc w:val="left"/>
+      <w:pPr>
+        <w:tabs>
+          <w:tab w:val="num" w:pos="6480"/>
+        </w:tabs>
+        <w:ind w:left="6480" w:hanging="360"/>
+      </w:pPr>
+    </w:lvl>
+  </w:abstractNum>
+  <w:abstractNum w:abstractNumId="18" w15:restartNumberingAfterBreak="0">
     <w:nsid w:val="43973D6B"/>
     <w:multiLevelType w:val="multilevel"/>
     <w:tmpl w:val="BF2EF218"/>
@@ -3882,7 +4491,7 @@
       </w:rPr>
     </w:lvl>
   </w:abstractNum>
-  <w:abstractNum w:abstractNumId="17" w15:restartNumberingAfterBreak="0">
+  <w:abstractNum w:abstractNumId="19" w15:restartNumberingAfterBreak="0">
     <w:nsid w:val="47A96206"/>
     <w:multiLevelType w:val="multilevel"/>
     <w:tmpl w:val="8AB24DEA"/>
@@ -3995,7 +4604,7 @@
       </w:pPr>
     </w:lvl>
   </w:abstractNum>
-  <w:abstractNum w:abstractNumId="18" w15:restartNumberingAfterBreak="0">
+  <w:abstractNum w:abstractNumId="20" w15:restartNumberingAfterBreak="0">
     <w:nsid w:val="480E765B"/>
     <w:multiLevelType w:val="multilevel"/>
     <w:tmpl w:val="9EB02FFC"/>
@@ -4144,7 +4753,7 @@
       </w:rPr>
     </w:lvl>
   </w:abstractNum>
-  <w:abstractNum w:abstractNumId="19" w15:restartNumberingAfterBreak="0">
+  <w:abstractNum w:abstractNumId="21" w15:restartNumberingAfterBreak="0">
     <w:nsid w:val="50273DC2"/>
     <w:multiLevelType w:val="multilevel"/>
     <w:tmpl w:val="D58E39AA"/>
@@ -4293,7 +4902,7 @@
       </w:rPr>
     </w:lvl>
   </w:abstractNum>
-  <w:abstractNum w:abstractNumId="20" w15:restartNumberingAfterBreak="0">
+  <w:abstractNum w:abstractNumId="22" w15:restartNumberingAfterBreak="0">
     <w:nsid w:val="50D5335B"/>
     <w:multiLevelType w:val="multilevel"/>
     <w:tmpl w:val="DACED160"/>
@@ -4442,7 +5051,7 @@
       </w:rPr>
     </w:lvl>
   </w:abstractNum>
-  <w:abstractNum w:abstractNumId="21" w15:restartNumberingAfterBreak="0">
+  <w:abstractNum w:abstractNumId="23" w15:restartNumberingAfterBreak="0">
     <w:nsid w:val="556A0F08"/>
     <w:multiLevelType w:val="multilevel"/>
     <w:tmpl w:val="A8707980"/>
@@ -4591,7 +5200,7 @@
       </w:rPr>
     </w:lvl>
   </w:abstractNum>
-  <w:abstractNum w:abstractNumId="22" w15:restartNumberingAfterBreak="0">
+  <w:abstractNum w:abstractNumId="24" w15:restartNumberingAfterBreak="0">
     <w:nsid w:val="57BF142D"/>
     <w:multiLevelType w:val="multilevel"/>
     <w:tmpl w:val="6DBC3568"/>
@@ -4740,7 +5349,7 @@
       </w:rPr>
     </w:lvl>
   </w:abstractNum>
-  <w:abstractNum w:abstractNumId="23" w15:restartNumberingAfterBreak="0">
+  <w:abstractNum w:abstractNumId="25" w15:restartNumberingAfterBreak="0">
     <w:nsid w:val="58AF6DC7"/>
     <w:multiLevelType w:val="multilevel"/>
     <w:tmpl w:val="632C1CEE"/>
@@ -4853,7 +5462,156 @@
       </w:pPr>
     </w:lvl>
   </w:abstractNum>
-  <w:abstractNum w:abstractNumId="24" w15:restartNumberingAfterBreak="0">
+  <w:abstractNum w:abstractNumId="26" w15:restartNumberingAfterBreak="0">
+    <w:nsid w:val="5DBD6442"/>
+    <w:multiLevelType w:val="multilevel"/>
+    <w:tmpl w:val="175C874A"/>
+    <w:lvl w:ilvl="0">
+      <w:start w:val="1"/>
+      <w:numFmt w:val="bullet"/>
+      <w:lvlText w:val=""/>
+      <w:lvlJc w:val="left"/>
+      <w:pPr>
+        <w:tabs>
+          <w:tab w:val="num" w:pos="720"/>
+        </w:tabs>
+        <w:ind w:left="720" w:hanging="360"/>
+      </w:pPr>
+      <w:rPr>
+        <w:rFonts w:ascii="Symbol" w:hAnsi="Symbol" w:hint="default"/>
+        <w:sz w:val="20"/>
+      </w:rPr>
+    </w:lvl>
+    <w:lvl w:ilvl="1" w:tentative="1">
+      <w:start w:val="1"/>
+      <w:numFmt w:val="bullet"/>
+      <w:lvlText w:val="o"/>
+      <w:lvlJc w:val="left"/>
+      <w:pPr>
+        <w:tabs>
+          <w:tab w:val="num" w:pos="1440"/>
+        </w:tabs>
+        <w:ind w:left="1440" w:hanging="360"/>
+      </w:pPr>
+      <w:rPr>
+        <w:rFonts w:ascii="Courier New" w:hAnsi="Courier New" w:hint="default"/>
+        <w:sz w:val="20"/>
+      </w:rPr>
+    </w:lvl>
+    <w:lvl w:ilvl="2" w:tentative="1">
+      <w:start w:val="1"/>
+      <w:numFmt w:val="bullet"/>
+      <w:lvlText w:val=""/>
+      <w:lvlJc w:val="left"/>
+      <w:pPr>
+        <w:tabs>
+          <w:tab w:val="num" w:pos="2160"/>
+        </w:tabs>
+        <w:ind w:left="2160" w:hanging="360"/>
+      </w:pPr>
+      <w:rPr>
+        <w:rFonts w:ascii="Wingdings" w:hAnsi="Wingdings" w:hint="default"/>
+        <w:sz w:val="20"/>
+      </w:rPr>
+    </w:lvl>
+    <w:lvl w:ilvl="3" w:tentative="1">
+      <w:start w:val="1"/>
+      <w:numFmt w:val="bullet"/>
+      <w:lvlText w:val=""/>
+      <w:lvlJc w:val="left"/>
+      <w:pPr>
+        <w:tabs>
+          <w:tab w:val="num" w:pos="2880"/>
+        </w:tabs>
+        <w:ind w:left="2880" w:hanging="360"/>
+      </w:pPr>
+      <w:rPr>
+        <w:rFonts w:ascii="Wingdings" w:hAnsi="Wingdings" w:hint="default"/>
+        <w:sz w:val="20"/>
+      </w:rPr>
+    </w:lvl>
+    <w:lvl w:ilvl="4" w:tentative="1">
+      <w:start w:val="1"/>
+      <w:numFmt w:val="bullet"/>
+      <w:lvlText w:val=""/>
+      <w:lvlJc w:val="left"/>
+      <w:pPr>
+        <w:tabs>
+          <w:tab w:val="num" w:pos="3600"/>
+        </w:tabs>
+        <w:ind w:left="3600" w:hanging="360"/>
+      </w:pPr>
+      <w:rPr>
+        <w:rFonts w:ascii="Wingdings" w:hAnsi="Wingdings" w:hint="default"/>
+        <w:sz w:val="20"/>
+      </w:rPr>
+    </w:lvl>
+    <w:lvl w:ilvl="5" w:tentative="1">
+      <w:start w:val="1"/>
+      <w:numFmt w:val="bullet"/>
+      <w:lvlText w:val=""/>
+      <w:lvlJc w:val="left"/>
+      <w:pPr>
+        <w:tabs>
+          <w:tab w:val="num" w:pos="4320"/>
+        </w:tabs>
+        <w:ind w:left="4320" w:hanging="360"/>
+      </w:pPr>
+      <w:rPr>
+        <w:rFonts w:ascii="Wingdings" w:hAnsi="Wingdings" w:hint="default"/>
+        <w:sz w:val="20"/>
+      </w:rPr>
+    </w:lvl>
+    <w:lvl w:ilvl="6" w:tentative="1">
+      <w:start w:val="1"/>
+      <w:numFmt w:val="bullet"/>
+      <w:lvlText w:val=""/>
+      <w:lvlJc w:val="left"/>
+      <w:pPr>
+        <w:tabs>
+          <w:tab w:val="num" w:pos="5040"/>
+        </w:tabs>
+        <w:ind w:left="5040" w:hanging="360"/>
+      </w:pPr>
+      <w:rPr>
+        <w:rFonts w:ascii="Wingdings" w:hAnsi="Wingdings" w:hint="default"/>
+        <w:sz w:val="20"/>
+      </w:rPr>
+    </w:lvl>
+    <w:lvl w:ilvl="7" w:tentative="1">
+      <w:start w:val="1"/>
+      <w:numFmt w:val="bullet"/>
+      <w:lvlText w:val=""/>
+      <w:lvlJc w:val="left"/>
+      <w:pPr>
+        <w:tabs>
+          <w:tab w:val="num" w:pos="5760"/>
+        </w:tabs>
+        <w:ind w:left="5760" w:hanging="360"/>
+      </w:pPr>
+      <w:rPr>
+        <w:rFonts w:ascii="Wingdings" w:hAnsi="Wingdings" w:hint="default"/>
+        <w:sz w:val="20"/>
+      </w:rPr>
+    </w:lvl>
+    <w:lvl w:ilvl="8" w:tentative="1">
+      <w:start w:val="1"/>
+      <w:numFmt w:val="bullet"/>
+      <w:lvlText w:val=""/>
+      <w:lvlJc w:val="left"/>
+      <w:pPr>
+        <w:tabs>
+          <w:tab w:val="num" w:pos="6480"/>
+        </w:tabs>
+        <w:ind w:left="6480" w:hanging="360"/>
+      </w:pPr>
+      <w:rPr>
+        <w:rFonts w:ascii="Wingdings" w:hAnsi="Wingdings" w:hint="default"/>
+        <w:sz w:val="20"/>
+      </w:rPr>
+    </w:lvl>
+  </w:abstractNum>
+  <w:abstractNum w:abstractNumId="27" w15:restartNumberingAfterBreak="0">
     <w:nsid w:val="5E727336"/>
     <w:multiLevelType w:val="multilevel"/>
     <w:tmpl w:val="3AC87CAE"/>
@@ -5002,7 +5760,7 @@
       </w:rPr>
     </w:lvl>
   </w:abstractNum>
-  <w:abstractNum w:abstractNumId="25" w15:restartNumberingAfterBreak="0">
+  <w:abstractNum w:abstractNumId="28" w15:restartNumberingAfterBreak="0">
     <w:nsid w:val="5F0A55E0"/>
     <w:multiLevelType w:val="multilevel"/>
     <w:tmpl w:val="76DE9062"/>
@@ -5151,7 +5909,120 @@
       </w:rPr>
     </w:lvl>
   </w:abstractNum>
-  <w:abstractNum w:abstractNumId="26" w15:restartNumberingAfterBreak="0">
+  <w:abstractNum w:abstractNumId="29" w15:restartNumberingAfterBreak="0">
+    <w:nsid w:val="623C6B69"/>
+    <w:multiLevelType w:val="multilevel"/>
+    <w:tmpl w:val="E012B014"/>
+    <w:lvl w:ilvl="0">
+      <w:start w:val="1"/>
+      <w:numFmt w:val="decimal"/>
+      <w:lvlText w:val="%1."/>
+      <w:lvlJc w:val="left"/>
+      <w:pPr>
+        <w:tabs>
+          <w:tab w:val="num" w:pos="720"/>
+        </w:tabs>
+        <w:ind w:left="720" w:hanging="360"/>
+      </w:pPr>
+    </w:lvl>
+    <w:lvl w:ilvl="1" w:tentative="1">
+      <w:start w:val="1"/>
+      <w:numFmt w:val="decimal"/>
+      <w:lvlText w:val="%2."/>
+      <w:lvlJc w:val="left"/>
+      <w:pPr>
+        <w:tabs>
+          <w:tab w:val="num" w:pos="1440"/>
+        </w:tabs>
+        <w:ind w:left="1440" w:hanging="360"/>
+      </w:pPr>
+    </w:lvl>
+    <w:lvl w:ilvl="2" w:tentative="1">
+      <w:start w:val="1"/>
+      <w:numFmt w:val="decimal"/>
+      <w:lvlText w:val="%3."/>
+      <w:lvlJc w:val="left"/>
+      <w:pPr>
+        <w:tabs>
+          <w:tab w:val="num" w:pos="2160"/>
+        </w:tabs>
+        <w:ind w:left="2160" w:hanging="360"/>
+      </w:pPr>
+    </w:lvl>
+    <w:lvl w:ilvl="3" w:tentative="1">
+      <w:start w:val="1"/>
+      <w:numFmt w:val="decimal"/>
+      <w:lvlText w:val="%4."/>
+      <w:lvlJc w:val="left"/>
+      <w:pPr>
+        <w:tabs>
+          <w:tab w:val="num" w:pos="2880"/>
+        </w:tabs>
+        <w:ind w:left="2880" w:hanging="360"/>
+      </w:pPr>
+    </w:lvl>
+    <w:lvl w:ilvl="4" w:tentative="1">
+      <w:start w:val="1"/>
+      <w:numFmt w:val="decimal"/>
+      <w:lvlText w:val="%5."/>
+      <w:lvlJc w:val="left"/>
+      <w:pPr>
+        <w:tabs>
+          <w:tab w:val="num" w:pos="3600"/>
+        </w:tabs>
+        <w:ind w:left="3600" w:hanging="360"/>
+      </w:pPr>
+    </w:lvl>
+    <w:lvl w:ilvl="5" w:tentative="1">
+      <w:start w:val="1"/>
+      <w:numFmt w:val="decimal"/>
+      <w:lvlText w:val="%6."/>
+      <w:lvlJc w:val="left"/>
+      <w:pPr>
+        <w:tabs>
+          <w:tab w:val="num" w:pos="4320"/>
+        </w:tabs>
+        <w:ind w:left="4320" w:hanging="360"/>
+      </w:pPr>
+    </w:lvl>
+    <w:lvl w:ilvl="6" w:tentative="1">
+      <w:start w:val="1"/>
+      <w:numFmt w:val="decimal"/>
+      <w:lvlText w:val="%7."/>
+      <w:lvlJc w:val="left"/>
+      <w:pPr>
+        <w:tabs>
+          <w:tab w:val="num" w:pos="5040"/>
+        </w:tabs>
+        <w:ind w:left="5040" w:hanging="360"/>
+      </w:pPr>
+    </w:lvl>
+    <w:lvl w:ilvl="7" w:tentative="1">
+      <w:start w:val="1"/>
+      <w:numFmt w:val="decimal"/>
+      <w:lvlText w:val="%8."/>
+      <w:lvlJc w:val="left"/>
+      <w:pPr>
+        <w:tabs>
+          <w:tab w:val="num" w:pos="5760"/>
+        </w:tabs>
+        <w:ind w:left="5760" w:hanging="360"/>
+      </w:pPr>
+    </w:lvl>
+    <w:lvl w:ilvl="8" w:tentative="1">
+      <w:start w:val="1"/>
+      <w:numFmt w:val="decimal"/>
+      <w:lvlText w:val="%9."/>
+      <w:lvlJc w:val="left"/>
+      <w:pPr>
+        <w:tabs>
+          <w:tab w:val="num" w:pos="6480"/>
+        </w:tabs>
+        <w:ind w:left="6480" w:hanging="360"/>
+      </w:pPr>
+    </w:lvl>
+  </w:abstractNum>
+  <w:abstractNum w:abstractNumId="30" w15:restartNumberingAfterBreak="0">
     <w:nsid w:val="6391797B"/>
     <w:multiLevelType w:val="multilevel"/>
     <w:tmpl w:val="4DEA7F62"/>
@@ -5264,7 +6135,7 @@
       </w:pPr>
     </w:lvl>
   </w:abstractNum>
-  <w:abstractNum w:abstractNumId="27" w15:restartNumberingAfterBreak="0">
+  <w:abstractNum w:abstractNumId="31" w15:restartNumberingAfterBreak="0">
     <w:nsid w:val="64265919"/>
     <w:multiLevelType w:val="multilevel"/>
     <w:tmpl w:val="BE02F854"/>
@@ -5413,7 +6284,7 @@
       </w:rPr>
     </w:lvl>
   </w:abstractNum>
-  <w:abstractNum w:abstractNumId="28" w15:restartNumberingAfterBreak="0">
+  <w:abstractNum w:abstractNumId="32" w15:restartNumberingAfterBreak="0">
     <w:nsid w:val="65F525E8"/>
     <w:multiLevelType w:val="multilevel"/>
     <w:tmpl w:val="D24A16D0"/>
@@ -5526,7 +6397,7 @@
       </w:pPr>
     </w:lvl>
   </w:abstractNum>
-  <w:abstractNum w:abstractNumId="29" w15:restartNumberingAfterBreak="0">
+  <w:abstractNum w:abstractNumId="33" w15:restartNumberingAfterBreak="0">
     <w:nsid w:val="679B719D"/>
     <w:multiLevelType w:val="multilevel"/>
     <w:tmpl w:val="C99E3E7C"/>
@@ -5675,7 +6546,7 @@
       </w:rPr>
     </w:lvl>
   </w:abstractNum>
-  <w:abstractNum w:abstractNumId="30" w15:restartNumberingAfterBreak="0">
+  <w:abstractNum w:abstractNumId="34" w15:restartNumberingAfterBreak="0">
     <w:nsid w:val="699421E2"/>
     <w:multiLevelType w:val="multilevel"/>
     <w:tmpl w:val="14566A70"/>
@@ -5824,7 +6695,7 @@
       </w:rPr>
     </w:lvl>
   </w:abstractNum>
-  <w:abstractNum w:abstractNumId="31" w15:restartNumberingAfterBreak="0">
+  <w:abstractNum w:abstractNumId="35" w15:restartNumberingAfterBreak="0">
     <w:nsid w:val="6C570E9E"/>
     <w:multiLevelType w:val="multilevel"/>
     <w:tmpl w:val="D0FC046C"/>
@@ -5973,7 +6844,156 @@
       </w:rPr>
     </w:lvl>
   </w:abstractNum>
-  <w:abstractNum w:abstractNumId="32" w15:restartNumberingAfterBreak="0">
+  <w:abstractNum w:abstractNumId="36" w15:restartNumberingAfterBreak="0">
+    <w:nsid w:val="6EDE072F"/>
+    <w:multiLevelType w:val="multilevel"/>
+    <w:tmpl w:val="9EAA4D1A"/>
+    <w:lvl w:ilvl="0">
+      <w:start w:val="1"/>
+      <w:numFmt w:val="bullet"/>
+      <w:lvlText w:val=""/>
+      <w:lvlJc w:val="left"/>
+      <w:pPr>
+        <w:tabs>
+          <w:tab w:val="num" w:pos="720"/>
+        </w:tabs>
+        <w:ind w:left="720" w:hanging="360"/>
+      </w:pPr>
+      <w:rPr>
+        <w:rFonts w:ascii="Symbol" w:hAnsi="Symbol" w:hint="default"/>
+        <w:sz w:val="20"/>
+      </w:rPr>
+    </w:lvl>
+    <w:lvl w:ilvl="1" w:tentative="1">
+      <w:start w:val="1"/>
+      <w:numFmt w:val="bullet"/>
+      <w:lvlText w:val="o"/>
+      <w:lvlJc w:val="left"/>
+      <w:pPr>
+        <w:tabs>
+          <w:tab w:val="num" w:pos="1440"/>
+        </w:tabs>
+        <w:ind w:left="1440" w:hanging="360"/>
+      </w:pPr>
+      <w:rPr>
+        <w:rFonts w:ascii="Courier New" w:hAnsi="Courier New" w:hint="default"/>
+        <w:sz w:val="20"/>
+      </w:rPr>
+    </w:lvl>
+    <w:lvl w:ilvl="2" w:tentative="1">
+      <w:start w:val="1"/>
+      <w:numFmt w:val="bullet"/>
+      <w:lvlText w:val=""/>
+      <w:lvlJc w:val="left"/>
+      <w:pPr>
+        <w:tabs>
+          <w:tab w:val="num" w:pos="2160"/>
+        </w:tabs>
+        <w:ind w:left="2160" w:hanging="360"/>
+      </w:pPr>
+      <w:rPr>
+        <w:rFonts w:ascii="Wingdings" w:hAnsi="Wingdings" w:hint="default"/>
+        <w:sz w:val="20"/>
+      </w:rPr>
+    </w:lvl>
+    <w:lvl w:ilvl="3" w:tentative="1">
+      <w:start w:val="1"/>
+      <w:numFmt w:val="bullet"/>
+      <w:lvlText w:val=""/>
+      <w:lvlJc w:val="left"/>
+      <w:pPr>
+        <w:tabs>
+          <w:tab w:val="num" w:pos="2880"/>
+        </w:tabs>
+        <w:ind w:left="2880" w:hanging="360"/>
+      </w:pPr>
+      <w:rPr>
+        <w:rFonts w:ascii="Wingdings" w:hAnsi="Wingdings" w:hint="default"/>
+        <w:sz w:val="20"/>
+      </w:rPr>
+    </w:lvl>
+    <w:lvl w:ilvl="4" w:tentative="1">
+      <w:start w:val="1"/>
+      <w:numFmt w:val="bullet"/>
+      <w:lvlText w:val=""/>
+      <w:lvlJc w:val="left"/>
+      <w:pPr>
+        <w:tabs>
+          <w:tab w:val="num" w:pos="3600"/>
+        </w:tabs>
+        <w:ind w:left="3600" w:hanging="360"/>
+      </w:pPr>
+      <w:rPr>
+        <w:rFonts w:ascii="Wingdings" w:hAnsi="Wingdings" w:hint="default"/>
+        <w:sz w:val="20"/>
+      </w:rPr>
+    </w:lvl>
+    <w:lvl w:ilvl="5" w:tentative="1">
+      <w:start w:val="1"/>
+      <w:numFmt w:val="bullet"/>
+      <w:lvlText w:val=""/>
+      <w:lvlJc w:val="left"/>
+      <w:pPr>
+        <w:tabs>
+          <w:tab w:val="num" w:pos="4320"/>
+        </w:tabs>
+        <w:ind w:left="4320" w:hanging="360"/>
+      </w:pPr>
+      <w:rPr>
+        <w:rFonts w:ascii="Wingdings" w:hAnsi="Wingdings" w:hint="default"/>
+        <w:sz w:val="20"/>
+      </w:rPr>
+    </w:lvl>
+    <w:lvl w:ilvl="6" w:tentative="1">
+      <w:start w:val="1"/>
+      <w:numFmt w:val="bullet"/>
+      <w:lvlText w:val=""/>
+      <w:lvlJc w:val="left"/>
+      <w:pPr>
+        <w:tabs>
+          <w:tab w:val="num" w:pos="5040"/>
+        </w:tabs>
+        <w:ind w:left="5040" w:hanging="360"/>
+      </w:pPr>
+      <w:rPr>
+        <w:rFonts w:ascii="Wingdings" w:hAnsi="Wingdings" w:hint="default"/>
+        <w:sz w:val="20"/>
+      </w:rPr>
+    </w:lvl>
+    <w:lvl w:ilvl="7" w:tentative="1">
+      <w:start w:val="1"/>
+      <w:numFmt w:val="bullet"/>
+      <w:lvlText w:val=""/>
+      <w:lvlJc w:val="left"/>
+      <w:pPr>
+        <w:tabs>
+          <w:tab w:val="num" w:pos="5760"/>
+        </w:tabs>
+        <w:ind w:left="5760" w:hanging="360"/>
+      </w:pPr>
+      <w:rPr>
+        <w:rFonts w:ascii="Wingdings" w:hAnsi="Wingdings" w:hint="default"/>
+        <w:sz w:val="20"/>
+      </w:rPr>
+    </w:lvl>
+    <w:lvl w:ilvl="8" w:tentative="1">
+      <w:start w:val="1"/>
+      <w:numFmt w:val="bullet"/>
+      <w:lvlText w:val=""/>
+      <w:lvlJc w:val="left"/>
+      <w:pPr>
+        <w:tabs>
+          <w:tab w:val="num" w:pos="6480"/>
+        </w:tabs>
+        <w:ind w:left="6480" w:hanging="360"/>
+      </w:pPr>
+      <w:rPr>
+        <w:rFonts w:ascii="Wingdings" w:hAnsi="Wingdings" w:hint="default"/>
+        <w:sz w:val="20"/>
+      </w:rPr>
+    </w:lvl>
+  </w:abstractNum>
+  <w:abstractNum w:abstractNumId="37" w15:restartNumberingAfterBreak="0">
     <w:nsid w:val="76E2010D"/>
     <w:multiLevelType w:val="multilevel"/>
     <w:tmpl w:val="F438B340"/>
@@ -6122,35 +7142,184 @@
       </w:rPr>
     </w:lvl>
   </w:abstractNum>
+  <w:abstractNum w:abstractNumId="38" w15:restartNumberingAfterBreak="0">
+    <w:nsid w:val="7A236A22"/>
+    <w:multiLevelType w:val="multilevel"/>
+    <w:tmpl w:val="E94E0086"/>
+    <w:lvl w:ilvl="0">
+      <w:start w:val="1"/>
+      <w:numFmt w:val="bullet"/>
+      <w:lvlText w:val=""/>
+      <w:lvlJc w:val="left"/>
+      <w:pPr>
+        <w:tabs>
+          <w:tab w:val="num" w:pos="720"/>
+        </w:tabs>
+        <w:ind w:left="720" w:hanging="360"/>
+      </w:pPr>
+      <w:rPr>
+        <w:rFonts w:ascii="Symbol" w:hAnsi="Symbol" w:hint="default"/>
+        <w:sz w:val="20"/>
+      </w:rPr>
+    </w:lvl>
+    <w:lvl w:ilvl="1" w:tentative="1">
+      <w:start w:val="1"/>
+      <w:numFmt w:val="bullet"/>
+      <w:lvlText w:val="o"/>
+      <w:lvlJc w:val="left"/>
+      <w:pPr>
+        <w:tabs>
+          <w:tab w:val="num" w:pos="1440"/>
+        </w:tabs>
+        <w:ind w:left="1440" w:hanging="360"/>
+      </w:pPr>
+      <w:rPr>
+        <w:rFonts w:ascii="Courier New" w:hAnsi="Courier New" w:hint="default"/>
+        <w:sz w:val="20"/>
+      </w:rPr>
+    </w:lvl>
+    <w:lvl w:ilvl="2" w:tentative="1">
+      <w:start w:val="1"/>
+      <w:numFmt w:val="bullet"/>
+      <w:lvlText w:val=""/>
+      <w:lvlJc w:val="left"/>
+      <w:pPr>
+        <w:tabs>
+          <w:tab w:val="num" w:pos="2160"/>
+        </w:tabs>
+        <w:ind w:left="2160" w:hanging="360"/>
+      </w:pPr>
+      <w:rPr>
+        <w:rFonts w:ascii="Wingdings" w:hAnsi="Wingdings" w:hint="default"/>
+        <w:sz w:val="20"/>
+      </w:rPr>
+    </w:lvl>
+    <w:lvl w:ilvl="3" w:tentative="1">
+      <w:start w:val="1"/>
+      <w:numFmt w:val="bullet"/>
+      <w:lvlText w:val=""/>
+      <w:lvlJc w:val="left"/>
+      <w:pPr>
+        <w:tabs>
+          <w:tab w:val="num" w:pos="2880"/>
+        </w:tabs>
+        <w:ind w:left="2880" w:hanging="360"/>
+      </w:pPr>
+      <w:rPr>
+        <w:rFonts w:ascii="Wingdings" w:hAnsi="Wingdings" w:hint="default"/>
+        <w:sz w:val="20"/>
+      </w:rPr>
+    </w:lvl>
+    <w:lvl w:ilvl="4" w:tentative="1">
+      <w:start w:val="1"/>
+      <w:numFmt w:val="bullet"/>
+      <w:lvlText w:val=""/>
+      <w:lvlJc w:val="left"/>
+      <w:pPr>
+        <w:tabs>
+          <w:tab w:val="num" w:pos="3600"/>
+        </w:tabs>
+        <w:ind w:left="3600" w:hanging="360"/>
+      </w:pPr>
+      <w:rPr>
+        <w:rFonts w:ascii="Wingdings" w:hAnsi="Wingdings" w:hint="default"/>
+        <w:sz w:val="20"/>
+      </w:rPr>
+    </w:lvl>
+    <w:lvl w:ilvl="5" w:tentative="1">
+      <w:start w:val="1"/>
+      <w:numFmt w:val="bullet"/>
+      <w:lvlText w:val=""/>
+      <w:lvlJc w:val="left"/>
+      <w:pPr>
+        <w:tabs>
+          <w:tab w:val="num" w:pos="4320"/>
+        </w:tabs>
+        <w:ind w:left="4320" w:hanging="360"/>
+      </w:pPr>
+      <w:rPr>
+        <w:rFonts w:ascii="Wingdings" w:hAnsi="Wingdings" w:hint="default"/>
+        <w:sz w:val="20"/>
+      </w:rPr>
+    </w:lvl>
+    <w:lvl w:ilvl="6" w:tentative="1">
+      <w:start w:val="1"/>
+      <w:numFmt w:val="bullet"/>
+      <w:lvlText w:val=""/>
+      <w:lvlJc w:val="left"/>
+      <w:pPr>
+        <w:tabs>
+          <w:tab w:val="num" w:pos="5040"/>
+        </w:tabs>
+        <w:ind w:left="5040" w:hanging="360"/>
+      </w:pPr>
+      <w:rPr>
+        <w:rFonts w:ascii="Wingdings" w:hAnsi="Wingdings" w:hint="default"/>
+        <w:sz w:val="20"/>
+      </w:rPr>
+    </w:lvl>
+    <w:lvl w:ilvl="7" w:tentative="1">
+      <w:start w:val="1"/>
+      <w:numFmt w:val="bullet"/>
+      <w:lvlText w:val=""/>
+      <w:lvlJc w:val="left"/>
+      <w:pPr>
+        <w:tabs>
+          <w:tab w:val="num" w:pos="5760"/>
+        </w:tabs>
+        <w:ind w:left="5760" w:hanging="360"/>
+      </w:pPr>
+      <w:rPr>
+        <w:rFonts w:ascii="Wingdings" w:hAnsi="Wingdings" w:hint="default"/>
+        <w:sz w:val="20"/>
+      </w:rPr>
+    </w:lvl>
+    <w:lvl w:ilvl="8" w:tentative="1">
+      <w:start w:val="1"/>
+      <w:numFmt w:val="bullet"/>
+      <w:lvlText w:val=""/>
+      <w:lvlJc w:val="left"/>
+      <w:pPr>
+        <w:tabs>
+          <w:tab w:val="num" w:pos="6480"/>
+        </w:tabs>
+        <w:ind w:left="6480" w:hanging="360"/>
+      </w:pPr>
+      <w:rPr>
+        <w:rFonts w:ascii="Wingdings" w:hAnsi="Wingdings" w:hint="default"/>
+        <w:sz w:val="20"/>
+      </w:rPr>
+    </w:lvl>
+  </w:abstractNum>
   <w:num w:numId="1" w16cid:durableId="1194423722">
-    <w:abstractNumId w:val="24"/>
+    <w:abstractNumId w:val="27"/>
   </w:num>
   <w:num w:numId="2" w16cid:durableId="1308507840">
-    <w:abstractNumId w:val="28"/>
+    <w:abstractNumId w:val="32"/>
   </w:num>
   <w:num w:numId="3" w16cid:durableId="338892109">
+    <w:abstractNumId w:val="11"/>
+  </w:num>
+  <w:num w:numId="4" w16cid:durableId="1286043199">
+    <w:abstractNumId w:val="16"/>
+  </w:num>
+  <w:num w:numId="5" w16cid:durableId="711343238">
     <w:abstractNumId w:val="10"/>
   </w:num>
-  <w:num w:numId="4" w16cid:durableId="1286043199">
+  <w:num w:numId="6" w16cid:durableId="317420227">
     <w:abstractNumId w:val="15"/>
   </w:num>
-  <w:num w:numId="5" w16cid:durableId="711343238">
-    <w:abstractNumId w:val="9"/>
-  </w:num>
-  <w:num w:numId="6" w16cid:durableId="317420227">
-    <w:abstractNumId w:val="14"/>
-  </w:num>
   <w:num w:numId="7" w16cid:durableId="1826319611">
-    <w:abstractNumId w:val="31"/>
+    <w:abstractNumId w:val="35"/>
   </w:num>
   <w:num w:numId="8" w16cid:durableId="2049184231">
-    <w:abstractNumId w:val="26"/>
+    <w:abstractNumId w:val="30"/>
   </w:num>
   <w:num w:numId="9" w16cid:durableId="57092283">
     <w:abstractNumId w:val="7"/>
   </w:num>
   <w:num w:numId="10" w16cid:durableId="1274093436">
-    <w:abstractNumId w:val="19"/>
+    <w:abstractNumId w:val="21"/>
   </w:num>
   <w:num w:numId="11" w16cid:durableId="193079191">
     <w:abstractNumId w:val="0"/>
@@ -6159,37 +7328,37 @@
     <w:abstractNumId w:val="4"/>
   </w:num>
   <w:num w:numId="13" w16cid:durableId="958612636">
-    <w:abstractNumId w:val="18"/>
+    <w:abstractNumId w:val="20"/>
   </w:num>
   <w:num w:numId="14" w16cid:durableId="1602833131">
-    <w:abstractNumId w:val="22"/>
+    <w:abstractNumId w:val="24"/>
   </w:num>
   <w:num w:numId="15" w16cid:durableId="1851873220">
     <w:abstractNumId w:val="1"/>
   </w:num>
   <w:num w:numId="16" w16cid:durableId="909001700">
+    <w:abstractNumId w:val="14"/>
+  </w:num>
+  <w:num w:numId="17" w16cid:durableId="1294826888">
     <w:abstractNumId w:val="13"/>
   </w:num>
-  <w:num w:numId="17" w16cid:durableId="1294826888">
-    <w:abstractNumId w:val="12"/>
-  </w:num>
   <w:num w:numId="18" w16cid:durableId="659044829">
-    <w:abstractNumId w:val="25"/>
+    <w:abstractNumId w:val="28"/>
   </w:num>
   <w:num w:numId="19" w16cid:durableId="341974399">
-    <w:abstractNumId w:val="27"/>
+    <w:abstractNumId w:val="31"/>
   </w:num>
   <w:num w:numId="20" w16cid:durableId="1304778195">
     <w:abstractNumId w:val="3"/>
   </w:num>
   <w:num w:numId="21" w16cid:durableId="1347175867">
-    <w:abstractNumId w:val="30"/>
+    <w:abstractNumId w:val="34"/>
   </w:num>
   <w:num w:numId="22" w16cid:durableId="1549298627">
-    <w:abstractNumId w:val="21"/>
+    <w:abstractNumId w:val="23"/>
   </w:num>
   <w:num w:numId="23" w16cid:durableId="1446924045">
-    <w:abstractNumId w:val="16"/>
+    <w:abstractNumId w:val="18"/>
   </w:num>
   <w:num w:numId="24" w16cid:durableId="2067875609">
     <w:abstractNumId w:val="2"/>
@@ -6201,25 +7370,43 @@
     <w:abstractNumId w:val="5"/>
   </w:num>
   <w:num w:numId="27" w16cid:durableId="156894035">
-    <w:abstractNumId w:val="32"/>
+    <w:abstractNumId w:val="37"/>
   </w:num>
   <w:num w:numId="28" w16cid:durableId="721248354">
-    <w:abstractNumId w:val="11"/>
+    <w:abstractNumId w:val="12"/>
   </w:num>
   <w:num w:numId="29" w16cid:durableId="833882117">
-    <w:abstractNumId w:val="17"/>
+    <w:abstractNumId w:val="19"/>
   </w:num>
   <w:num w:numId="30" w16cid:durableId="1707372010">
-    <w:abstractNumId w:val="23"/>
+    <w:abstractNumId w:val="25"/>
   </w:num>
   <w:num w:numId="31" w16cid:durableId="2009019060">
-    <w:abstractNumId w:val="29"/>
+    <w:abstractNumId w:val="33"/>
   </w:num>
   <w:num w:numId="32" w16cid:durableId="1589079255">
-    <w:abstractNumId w:val="20"/>
+    <w:abstractNumId w:val="22"/>
   </w:num>
   <w:num w:numId="33" w16cid:durableId="956521476">
     <w:abstractNumId w:val="6"/>
+  </w:num>
+  <w:num w:numId="34" w16cid:durableId="30229293">
+    <w:abstractNumId w:val="17"/>
+  </w:num>
+  <w:num w:numId="35" w16cid:durableId="1705598051">
+    <w:abstractNumId w:val="9"/>
+  </w:num>
+  <w:num w:numId="36" w16cid:durableId="468285290">
+    <w:abstractNumId w:val="38"/>
+  </w:num>
+  <w:num w:numId="37" w16cid:durableId="1785608583">
+    <w:abstractNumId w:val="36"/>
+  </w:num>
+  <w:num w:numId="38" w16cid:durableId="583807434">
+    <w:abstractNumId w:val="26"/>
+  </w:num>
+  <w:num w:numId="39" w16cid:durableId="1232232023">
+    <w:abstractNumId w:val="29"/>
   </w:num>
 </w:numbering>
 </file>
@@ -6681,6 +7868,29 @@
       <w:szCs w:val="27"/>
     </w:rPr>
   </w:style>
+  <w:style w:type="paragraph" w:styleId="Heading4">
+    <w:name w:val="heading 4"/>
+    <w:basedOn w:val="Normal"/>
+    <w:next w:val="Normal"/>
+    <w:link w:val="Heading4Char"/>
+    <w:uiPriority w:val="9"/>
+    <w:semiHidden/>
+    <w:unhideWhenUsed/>
+    <w:qFormat/>
+    <w:rsid w:val="0077768A"/>
+    <w:pPr>
+      <w:keepNext/>
+      <w:keepLines/>
+      <w:spacing w:before="40" w:after="0"/>
+      <w:outlineLvl w:val="3"/>
+    </w:pPr>
+    <w:rPr>
+      <w:rFonts w:asciiTheme="majorHAnsi" w:eastAsiaTheme="majorEastAsia" w:hAnsiTheme="majorHAnsi" w:cstheme="majorBidi"/>
+      <w:i/>
+      <w:iCs/>
+      <w:color w:val="2F5496" w:themeColor="accent1" w:themeShade="BF"/>
+    </w:rPr>
+  </w:style>
   <w:style w:type="character" w:default="1" w:styleId="DefaultParagraphFont">
     <w:name w:val="Default Paragraph Font"/>
     <w:uiPriority w:val="1"/>
@@ -6755,7 +7965,6 @@
     <w:name w:val="Normal (Web)"/>
     <w:basedOn w:val="Normal"/>
     <w:uiPriority w:val="99"/>
-    <w:semiHidden/>
     <w:unhideWhenUsed/>
     <w:rsid w:val="009F5BCE"/>
     <w:pPr>
@@ -6884,6 +8093,25 @@
     <w:name w:val="mclose"/>
     <w:basedOn w:val="DefaultParagraphFont"/>
     <w:rsid w:val="00D7366A"/>
+  </w:style>
+  <w:style w:type="character" w:customStyle="1" w:styleId="Heading4Char">
+    <w:name w:val="Heading 4 Char"/>
+    <w:basedOn w:val="DefaultParagraphFont"/>
+    <w:link w:val="Heading4"/>
+    <w:uiPriority w:val="9"/>
+    <w:semiHidden/>
+    <w:rsid w:val="0077768A"/>
+    <w:rPr>
+      <w:rFonts w:asciiTheme="majorHAnsi" w:eastAsiaTheme="majorEastAsia" w:hAnsiTheme="majorHAnsi" w:cstheme="majorBidi"/>
+      <w:i/>
+      <w:iCs/>
+      <w:color w:val="2F5496" w:themeColor="accent1" w:themeShade="BF"/>
+    </w:rPr>
+  </w:style>
+  <w:style w:type="character" w:customStyle="1" w:styleId="mop">
+    <w:name w:val="mop"/>
+    <w:basedOn w:val="DefaultParagraphFont"/>
+    <w:rsid w:val="0077768A"/>
   </w:style>
 </w:styles>
 </file>

</xml_diff>